<commit_message>
after kirstin & Marcus
</commit_message>
<xml_diff>
--- a/_manuscript/index.docx
+++ b/_manuscript/index.docx
@@ -24,7 +24,7 @@
         <w:pStyle w:val="Heading1"/>
       </w:pPr>
       <w:r>
-        <w:t xml:space="preserve">Evidenz.Besser.Kommunizieren.: Wie Bildungswissenschaften und Fachdidaktiken ihre Wissenschaftskommunikation weiterentwickeln können.</w:t>
+        <w:t xml:space="preserve">Evidenz. Besser. Kommunizieren.</w:t>
       </w:r>
     </w:p>
     <w:p>
@@ -467,7 +467,7 @@
         <w:pStyle w:val="Heading1"/>
       </w:pPr>
       <w:r>
-        <w:t xml:space="preserve">Evidenz.Besser.Kommunizieren.: Wie Bildungswissenschaften und Fachdidaktiken ihre Wissenschaftskommunikation weiterentwickeln können.</w:t>
+        <w:t xml:space="preserve">Evidenz. Besser. Kommunizieren.</w:t>
       </w:r>
     </w:p>
     <w:p>
@@ -488,7 +488,7 @@
           <w:rPr>
             <w:rStyle w:val="Hyperlink"/>
           </w:rPr>
-          <w:t xml:space="preserve">Bohl 2020</w:t>
+          <w:t xml:space="preserve">Bohl, 2020</w:t>
         </w:r>
       </w:hyperlink>
       <w:r>
@@ -511,7 +511,7 @@
           <w:rPr>
             <w:rStyle w:val="Hyperlink"/>
           </w:rPr>
-          <w:t xml:space="preserve">K.-O. Bauer und Rolff 1978</w:t>
+          <w:t xml:space="preserve">K.-O. Bauer &amp; Rolff, 1978</w:t>
         </w:r>
       </w:hyperlink>
       <w:r>
@@ -534,7 +534,7 @@
           <w:rPr>
             <w:rStyle w:val="Hyperlink"/>
           </w:rPr>
-          <w:t xml:space="preserve">Helmke 2022</w:t>
+          <w:t xml:space="preserve">Helmke, 2022</w:t>
         </w:r>
       </w:hyperlink>
       <w:r>
@@ -557,7 +557,7 @@
           <w:rPr>
             <w:rStyle w:val="Hyperlink"/>
           </w:rPr>
-          <w:t xml:space="preserve">Holtappels 2007</w:t>
+          <w:t xml:space="preserve">Holtappels, 2007</w:t>
         </w:r>
       </w:hyperlink>
       <w:r>
@@ -580,7 +580,7 @@
           <w:rPr>
             <w:rStyle w:val="Hyperlink"/>
           </w:rPr>
-          <w:t xml:space="preserve">Brügelmann 2018</w:t>
+          <w:t xml:space="preserve">Brügelmann, 2018</w:t>
         </w:r>
       </w:hyperlink>
       <w:r>
@@ -600,7 +600,7 @@
           <w:rPr>
             <w:rStyle w:val="Hyperlink"/>
           </w:rPr>
-          <w:t xml:space="preserve">Altrichter und Rolff 2006</w:t>
+          <w:t xml:space="preserve">Altrichter &amp; Rolff, 2006</w:t>
         </w:r>
       </w:hyperlink>
       <w:r>
@@ -620,7 +620,7 @@
           <w:rPr>
             <w:rStyle w:val="Hyperlink"/>
           </w:rPr>
-          <w:t xml:space="preserve">AERO 2023</w:t>
+          <w:t xml:space="preserve">AERO, 2023</w:t>
         </w:r>
       </w:hyperlink>
       <w:r>
@@ -634,7 +634,7 @@
           <w:rPr>
             <w:rStyle w:val="Hyperlink"/>
           </w:rPr>
-          <w:t xml:space="preserve">J. Bauer und Prenzel 2012</w:t>
+          <w:t xml:space="preserve">J. Bauer &amp; Prenzel, 2012</w:t>
         </w:r>
       </w:hyperlink>
       <w:r>
@@ -648,7 +648,7 @@
           <w:rPr>
             <w:rStyle w:val="Hyperlink"/>
           </w:rPr>
-          <w:t xml:space="preserve">Council of the European Union 2024</w:t>
+          <w:t xml:space="preserve">Council of the European Union, 2024</w:t>
         </w:r>
       </w:hyperlink>
       <w:r>
@@ -662,7 +662,7 @@
           <w:rPr>
             <w:rStyle w:val="Hyperlink"/>
           </w:rPr>
-          <w:t xml:space="preserve">Pellegrini und Vivanet 2021</w:t>
+          <w:t xml:space="preserve">Pellegrini &amp; Vivanet, 2021</w:t>
         </w:r>
       </w:hyperlink>
       <w:r>
@@ -676,14 +676,37 @@
           <w:rPr>
             <w:rStyle w:val="Hyperlink"/>
           </w:rPr>
-          <w:t xml:space="preserve">Slavin 2020</w:t>
+          <w:t xml:space="preserve">Slavin, 2020</w:t>
         </w:r>
       </w:hyperlink>
       <w:r>
         <w:t xml:space="preserve">)</w:t>
       </w:r>
       <w:r>
-        <w:t xml:space="preserve">. Da jedoch einerseits die Genese und Interpretation von Evidenz nicht zu den professionellen Kernkompetenzen von Lehrkäften gehört und andererseits Bildungswissenschaftler- und Fachdidaktiker:innen keine Expert:innen für die Gestaltung von Schule und Unterricht sind, plädiert der vorliegende Beitrag dafür, Wissenschaftskommunikation erstens als wichtige Aufgabe von Bildungswissenschaftler:innen und Fachdidaktiker:innen aufzufassen, das Gelingen von Wissenschaftkommunikation zum Gegenstand empirischer Forschung zu machen und die Entwicklung von neuen Wissenschaftskommunikationsformaten als dialogischen Prozess zwischen Bildungswissenschaften/Fachdidaktiken und Lehrkräften aufzufassen.</w:t>
+        <w:t xml:space="preserve">. Da jedoch einerseits die Genese und Interpretation von Evidenz nicht zu den ausgeprägesten professionellen Kompetenzen von Lehrkäften gehört</w:t>
+      </w:r>
+      <w:r>
+        <w:t xml:space="preserve"> </w:t>
+      </w:r>
+      <w:r>
+        <w:t xml:space="preserve">(</w:t>
+      </w:r>
+      <w:hyperlink w:anchor="ref-gussen2023">
+        <w:r>
+          <w:rPr>
+            <w:rStyle w:val="Hyperlink"/>
+          </w:rPr>
+          <w:t xml:space="preserve">Gussen et al., 2023</w:t>
+        </w:r>
+      </w:hyperlink>
+      <w:r>
+        <w:t xml:space="preserve">)</w:t>
+      </w:r>
+      <w:r>
+        <w:t xml:space="preserve"> </w:t>
+      </w:r>
+      <w:r>
+        <w:t xml:space="preserve">und andererseits Bildungswissenschaftler- und Fachdidaktiker:innen wohl oft keine Expert:innen für die praktische Gestaltung von Schule und Unterricht sein dürften, plädiert der vorliegende Beitrag dafür, Wissenschaftskommunikation erstens als wichtige Aufgabe von Bildungswissenschaftler:innen und Fachdidaktiker:innen aufzufassen, zweitens das Gelingen von Wissenschaftskommunikation zum Gegenstand empirischer Forschung zu machen und drittens die Entwicklung von neuen Wissenschaftskommunikationsformaten als dialogischen Prozess zwischen Bildungswissenschaften, Fachdidaktiken und (angehenden) Lehrkräften aufzufassen.</w:t>
       </w:r>
     </w:p>
     <w:p>
@@ -691,7 +714,7 @@
         <w:pStyle w:val="BodyText"/>
       </w:pPr>
       <w:r>
-        <w:t xml:space="preserve">Daher führt der folgende theoretische Hintergrund zunächst in Konzepte und Begriffe evidenzinformierter Praxis ein, bevor er auf Wissenschaftskommunikation in Bildungswissenschaften und Fachdidaktiken eingeht, um abschließend ein empirisches Beispiel zu skizzieren.</w:t>
+        <w:t xml:space="preserve">Zur Ableitung dieser Plädoyers, enthält der vorliegende Beitrag zunächst einen theoretischen Hintergrund, in welchem Konzepte und Begriffe evidenzinformierter Praxis erläutert sowie auf Wissenschaftskommunikation in der Lehrpersonenbildung eingegangen wird. Anschließend wird die vorliegende Studie – ein kleines Experiment zur Kommunikation der Entwicklung der Lesekompetenz in den deutschen Kohorten des Programme of International Student Assessment (PISA) – als empirisches Beispiel angeführt.</w:t>
       </w:r>
     </w:p>
     <w:bookmarkEnd w:id="33"/>
@@ -740,7 +763,7 @@
           <w:rPr>
             <w:rStyle w:val="Hyperlink"/>
           </w:rPr>
-          <w:t xml:space="preserve">Kluge 2011, S. 263</w:t>
+          <w:t xml:space="preserve">Kluge, 2011, S. 263</w:t>
         </w:r>
       </w:hyperlink>
       <w:r>
@@ -763,7 +786,7 @@
           <w:rPr>
             <w:rStyle w:val="Hyperlink"/>
           </w:rPr>
-          <w:t xml:space="preserve">Hau et al. 2012</w:t>
+          <w:t xml:space="preserve">Hau et al., 2012</w:t>
         </w:r>
       </w:hyperlink>
       <w:r>
@@ -786,7 +809,7 @@
           <w:rPr>
             <w:rStyle w:val="Hyperlink"/>
           </w:rPr>
-          <w:t xml:space="preserve">Stark 2017</w:t>
+          <w:t xml:space="preserve">Stark, 2017</w:t>
         </w:r>
       </w:hyperlink>
       <w:r>
@@ -806,7 +829,7 @@
           <w:rPr>
             <w:rStyle w:val="Hyperlink"/>
           </w:rPr>
-          <w:t xml:space="preserve">Stark 2017</w:t>
+          <w:t xml:space="preserve">Stark, 2017</w:t>
         </w:r>
       </w:hyperlink>
       <w:r>
@@ -826,7 +849,7 @@
           <w:rPr>
             <w:rStyle w:val="Hyperlink"/>
           </w:rPr>
-          <w:t xml:space="preserve">Bromme et al. 2014</w:t>
+          <w:t xml:space="preserve">Bromme et al., 2014</w:t>
         </w:r>
       </w:hyperlink>
       <w:r>
@@ -849,7 +872,7 @@
           <w:rPr>
             <w:rStyle w:val="Hyperlink"/>
           </w:rPr>
-          <w:t xml:space="preserve">Shavelson und Towne 2002</w:t>
+          <w:t xml:space="preserve">Shavelson &amp; Towne, 2002, S. 18</w:t>
         </w:r>
       </w:hyperlink>
       <w:r>
@@ -895,7 +918,7 @@
           <w:rPr>
             <w:rStyle w:val="Hyperlink"/>
           </w:rPr>
-          <w:t xml:space="preserve">Renkl 2022</w:t>
+          <w:t xml:space="preserve">Renkl, 2022</w:t>
         </w:r>
       </w:hyperlink>
       <w:r>
@@ -936,7 +959,7 @@
           <w:rPr>
             <w:rStyle w:val="Hyperlink"/>
           </w:rPr>
-          <w:t xml:space="preserve">Kelley 1927</w:t>
+          <w:t xml:space="preserve">Kelley, 1927</w:t>
         </w:r>
       </w:hyperlink>
       <w:r>
@@ -950,7 +973,7 @@
           <w:rPr>
             <w:rStyle w:val="Hyperlink"/>
           </w:rPr>
-          <w:t xml:space="preserve">Thorndike 1904</w:t>
+          <w:t xml:space="preserve">Thorndike, 1904</w:t>
         </w:r>
       </w:hyperlink>
       <w:r>
@@ -960,7 +983,7 @@
         <w:t xml:space="preserve"> </w:t>
       </w:r>
       <w:r>
-        <w:t xml:space="preserve">darstellen - dass also unterschiedliche Begriffe für das Gleiche und gleiche Begriffe für Unterschiedliches gebraucht werden. Dabei speisen sich die Differenzierungen von evidenz</w:t>
+        <w:t xml:space="preserve">- dass also unterschiedliche Begriffe für das Gleiche und gleiche Begriffe für Unterschiedliches gebraucht werden. Dabei speisen sich die Differenzierungen von evidenz</w:t>
       </w:r>
       <w:r>
         <w:rPr>
@@ -1012,7 +1035,7 @@
           <w:rPr>
             <w:rStyle w:val="Hyperlink"/>
           </w:rPr>
-          <w:t xml:space="preserve">Schmid und Lutz 2007</w:t>
+          <w:t xml:space="preserve">Schmid &amp; Lutz, 2007</w:t>
         </w:r>
       </w:hyperlink>
       <w:r>
@@ -1048,7 +1071,7 @@
           <w:rPr>
             <w:rStyle w:val="Hyperlink"/>
           </w:rPr>
-          <w:t xml:space="preserve">Jones 2024</w:t>
+          <w:t xml:space="preserve">Jones, 2024</w:t>
         </w:r>
       </w:hyperlink>
       <w:r>
@@ -1094,7 +1117,7 @@
           <w:rPr>
             <w:rStyle w:val="Hyperlink"/>
           </w:rPr>
-          <w:t xml:space="preserve">Stark 2017</w:t>
+          <w:t xml:space="preserve">Stark, 2017</w:t>
         </w:r>
       </w:hyperlink>
       <w:r>
@@ -1197,7 +1220,7 @@
         <w:pStyle w:val="FirstParagraph"/>
       </w:pPr>
       <w:r>
-        <w:t xml:space="preserve">Unabhängig vom Kontext und der Funktion evidenzinformierter Entscheidungen ist es plausibel anzunehmen, dass eine erfolgreiche Kommunikation im Sinne der Induktionen eines adäquaten Verständnisses von Evidenz zwischen Bildungswissenschaftler:innen/Fachdidaktiker:innen und den Akteuren im Bildungssystem eine notwendige Voraussetzung für das Gelingen evidenzinformierter Entscheidungen ist: Wird Evidenz fehlinterpretiert und erfolgt eine anschließende Entscheidung kohärent zu dieser Fehlinterpretation, wird die Wirkung dieser Entscheidung nicht die Erwünschte sein.</w:t>
+        <w:t xml:space="preserve">Unabhängig vom Kontext und der Funktion evidenzinformierter Entscheidungen ist es plausibel anzunehmen, dass eine erfolgreiche Kommunikation von Evidenz (im Sinne der Induktionen einer homomorphen Auffassung) eine notwendige Voraussetzung für das Gelingen evidenzinformierter Entscheidungen ist: Wird Evidenz fehlinterpretiert und erfolgt eine anschließende Entscheidung kohärent zu dieser Fehlinterpretation, wird die Wirkung dieser Entscheidung nicht die Erwünschte sein.</w:t>
       </w:r>
     </w:p>
     <w:bookmarkStart w:id="42" w:name="cell-fig-AbbildungMoMa"/>
@@ -1215,7 +1238,7 @@
         <w:pStyle w:val="Caption"/>
       </w:pPr>
       <w:r>
-        <w:t xml:space="preserve">Daten einer (fiktiven) Studie, eine dazugehörige Pressemitteilung und die Vorstellung einer Lehrkraft von den Daten</w:t>
+        <w:t xml:space="preserve">Daten der (fiktiven) Studie, Pressemitteilung und Vorstellung der Lehrkraft</w:t>
       </w:r>
     </w:p>
     <w:p>
@@ -1342,7 +1365,7 @@
           <w:rPr>
             <w:rStyle w:val="Hyperlink"/>
           </w:rPr>
-          <w:t xml:space="preserve">Schmidt et al. 2023</w:t>
+          <w:t xml:space="preserve">Schmidt et al., 2023</w:t>
         </w:r>
       </w:hyperlink>
       <w:r>
@@ -1365,7 +1388,7 @@
         <w:t xml:space="preserve">p</w:t>
       </w:r>
       <w:r>
-        <w:t xml:space="preserve">-Wert), interpretiert die Lehrkraft diese Formulierung als »Unterschied bedeutsamer Größe«. Folglich schlussfolgert sie, dass es Sinn macht Geld und Zeit in Anschaffung und Implementation des KI-Lesetutors zu investieren, weil sie den KI-Lesetutor für deutlich lernwirksamer hält als lautes Lesen, obwohl etwa die Implementation von Lautlesetandems lernwirksamer, kostengünstiger und weniger zeitaufwändig gewesen wäre.</w:t>
+        <w:t xml:space="preserve">-Wert), interpretiert die Lehrkraft diese Formulierung als »Unterschied bedeutsamer Größe«. Folglich schlussfolgert sie, dass es Sinn macht Geld und Zeit in Anschaffung und Implementation des KI-Lesetutors zu investieren, weil sie den KI-Lesetutor für deutlich lernwirksamer hält als lautes Lesen, obwohl evtl. die Implementation weiterer Maßnahmen effektiver, kostengünstiger und weniger zeitaufwändig gewesen wäre.</w:t>
       </w:r>
     </w:p>
     <w:p>
@@ -1386,7 +1409,7 @@
           <w:rPr>
             <w:rStyle w:val="Hyperlink"/>
           </w:rPr>
-          <w:t xml:space="preserve">Schmidt et al. 2023</w:t>
+          <w:t xml:space="preserve">Schmidt et al., 2023</w:t>
         </w:r>
       </w:hyperlink>
       <w:r>
@@ -1409,7 +1432,7 @@
           <w:rPr>
             <w:rStyle w:val="Hyperlink"/>
           </w:rPr>
-          <w:t xml:space="preserve">Michal und Shah 2024</w:t>
+          <w:t xml:space="preserve">Michal &amp; Shah, 2024</w:t>
         </w:r>
       </w:hyperlink>
       <w:r>
@@ -1429,7 +1452,7 @@
           <w:rPr>
             <w:rStyle w:val="Hyperlink"/>
           </w:rPr>
-          <w:t xml:space="preserve">Masnick und Zimmerman 2009</w:t>
+          <w:t xml:space="preserve">Masnick &amp; Zimmerman, 2009</w:t>
         </w:r>
       </w:hyperlink>
       <w:r>
@@ -1471,7 +1494,7 @@
           <w:rPr>
             <w:rStyle w:val="Hyperlink"/>
           </w:rPr>
-          <w:t xml:space="preserve">Bohrer et al. 2025</w:t>
+          <w:t xml:space="preserve">Bohrer et al., 2025</w:t>
         </w:r>
       </w:hyperlink>
       <w:r>
@@ -1502,14 +1525,14 @@
           <w:rPr>
             <w:rStyle w:val="Hyperlink"/>
           </w:rPr>
-          <w:t xml:space="preserve">Schneider et al. 2024</w:t>
+          <w:t xml:space="preserve">Schneider et al., 2024</w:t>
         </w:r>
       </w:hyperlink>
       <w:r>
         <w:t xml:space="preserve">)</w:t>
       </w:r>
       <w:r>
-        <w:t xml:space="preserve">. Grundsätzlich lassen sich die bisherigen Befunde in angebotsseitige und nutzendenseitige Ansätze unterscheiden, also in Interventionen, die die Auswahl und Darstellung der Evidenz optimieren möchten und Ansätze, die bei der Scientific, Data und Statistical Literacy der Lehrkräfte ansetzen</w:t>
+        <w:t xml:space="preserve">. Grundsätzlich lassen sich die bisherigen Befunde in angebotsseitige und nutzendenseitige Ansätze unterscheiden, also in Interventionen, die die Auswahl und Darstellung der Evidenz optimieren möchten und Ansätze, die bei der Scientific, Data und Statistical Literacy der (angehenden) Lehrkräfte ansetzen</w:t>
       </w:r>
       <w:r>
         <w:t xml:space="preserve"> </w:t>
@@ -1522,7 +1545,7 @@
           <w:rPr>
             <w:rStyle w:val="Hyperlink"/>
           </w:rPr>
-          <w:t xml:space="preserve">Brühwiler und Leutwyler 2020</w:t>
+          <w:t xml:space="preserve">Brühwiler &amp; Leutwyler, 2020</w:t>
         </w:r>
       </w:hyperlink>
       <w:r>
@@ -1550,14 +1573,14 @@
           <w:rPr>
             <w:rStyle w:val="Hyperlink"/>
           </w:rPr>
-          <w:t xml:space="preserve">Schildkamp et al. 2018</w:t>
+          <w:t xml:space="preserve">Schildkamp et al., 2018</w:t>
         </w:r>
       </w:hyperlink>
       <w:r>
         <w:t xml:space="preserve">)</w:t>
       </w:r>
       <w:r>
-        <w:t xml:space="preserve">, welche durch ein umfängliches Set an vordefinierten Leitlinien und Aktivitäten versucht, konkrete schulische Probleme mit Hilfe von (oft eigens dafür genierten) Daten zu lösen, wobei meist 4-6 Lehrkräfte und Schulleiter:innen mit Bildungswissenschaftler:innen und Fachdidaktiker:innen kooperieren. Hierzu gehören auch »Brokering-Ansätze« (teilweise auch als »research practice partnerships« bezeichnet), in welchen Wissenschaftler:innen und Lehrpersonen (insbesondere Schulleitungen) gemeinsam versuchen, konkrete schulischen Probleme unter Rückgriff auf wissenschaftliche Erkenntnisse zu lösen</w:t>
+        <w:t xml:space="preserve">, welche durch ein umfängliches Set an vordefinierten Leitlinien und Aktivitäten versucht, konkrete schulische Probleme mit Hilfe von (oft eigens dafür genierten) Daten zu lösen, wobei meist 4-6 Lehrkräfte und Schulleiter:innen mit Bildungswissenschaftler:innen und Fachdidaktiker:innen kooperieren. Hierzu gehören auch »Brokering-Ansätze« (teilweise als »research practice partnerships« bezeichnet), in welchen Wissenschaftler:innen und Lehrpersonen (insbesondere Schulleitungen) gemeinsam versuchen, konkrete schulischen Probleme unter Rückgriff auf wissenschaftliche Erkenntnisse zu lösen</w:t>
       </w:r>
       <w:r>
         <w:t xml:space="preserve"> </w:t>
@@ -1573,14 +1596,14 @@
           <w:rPr>
             <w:rStyle w:val="Hyperlink"/>
           </w:rPr>
-          <w:t xml:space="preserve">Sharples und Sheard 2015</w:t>
+          <w:t xml:space="preserve">Sharples &amp; Sheard, 2015</w:t>
         </w:r>
       </w:hyperlink>
       <w:r>
         <w:t xml:space="preserve">)</w:t>
       </w:r>
       <w:r>
-        <w:t xml:space="preserve">. Auch Kurz-</w:t>
+        <w:t xml:space="preserve">. Zudem können kurz-</w:t>
       </w:r>
       <w:r>
         <w:t xml:space="preserve"> </w:t>
@@ -1593,7 +1616,7 @@
           <w:rPr>
             <w:rStyle w:val="Hyperlink"/>
           </w:rPr>
-          <w:t xml:space="preserve">Merk et al. 2020</w:t>
+          <w:t xml:space="preserve">Merk et al., 2020</w:t>
         </w:r>
       </w:hyperlink>
       <w:r>
@@ -1603,7 +1626,7 @@
         <w:t xml:space="preserve"> </w:t>
       </w:r>
       <w:r>
-        <w:t xml:space="preserve">oder längerfristig angelegte</w:t>
+        <w:t xml:space="preserve">oder längerfristig</w:t>
       </w:r>
       <w:r>
         <w:t xml:space="preserve"> </w:t>
@@ -1616,7 +1639,7 @@
           <w:rPr>
             <w:rStyle w:val="Hyperlink"/>
           </w:rPr>
-          <w:t xml:space="preserve">Karst et al. 2024</w:t>
+          <w:t xml:space="preserve">Karst et al., 2024</w:t>
         </w:r>
       </w:hyperlink>
       <w:r>
@@ -1626,7 +1649,7 @@
         <w:t xml:space="preserve"> </w:t>
       </w:r>
       <w:r>
-        <w:t xml:space="preserve">Interventionen zur Anbahnung notwendiger Kompetenzen für evidenzinformiertes Handeln wie die Interpretation von grafisch dargestellten Daten</w:t>
+        <w:t xml:space="preserve">angelegte Interventionen zur Anbahnung notwendiger Kompetenzen für evidenzinformiertes Handeln wie die Interpretation von grafisch dargestellten Daten</w:t>
       </w:r>
       <w:r>
         <w:t xml:space="preserve"> </w:t>
@@ -1639,7 +1662,7 @@
           <w:rPr>
             <w:rStyle w:val="Hyperlink"/>
           </w:rPr>
-          <w:t xml:space="preserve">Friel et al. 2001</w:t>
+          <w:t xml:space="preserve">Friel et al., 2001</w:t>
         </w:r>
       </w:hyperlink>
       <w:r>
@@ -1662,7 +1685,7 @@
           <w:rPr>
             <w:rStyle w:val="Hyperlink"/>
           </w:rPr>
-          <w:t xml:space="preserve">Neuenschwander 2005</w:t>
+          <w:t xml:space="preserve">Neuenschwander, 2005</w:t>
         </w:r>
       </w:hyperlink>
       <w:r>
@@ -1685,14 +1708,14 @@
           <w:rPr>
             <w:rStyle w:val="Hyperlink"/>
           </w:rPr>
-          <w:t xml:space="preserve">Clearing House Unterricht Academy 2025</w:t>
+          <w:t xml:space="preserve">Clearing House Unterricht Academy, 2025</w:t>
         </w:r>
       </w:hyperlink>
       <w:r>
         <w:t xml:space="preserve">)</w:t>
       </w:r>
       <w:r>
-        <w:t xml:space="preserve">, können diesem Ansatz zugerechnet werden.</w:t>
+        <w:t xml:space="preserve">, diesem Ansatz zugerechnet werden.</w:t>
       </w:r>
     </w:p>
     <w:p>
@@ -1713,7 +1736,7 @@
           <w:rPr>
             <w:rStyle w:val="Hyperlink"/>
           </w:rPr>
-          <w:t xml:space="preserve">Grice et al. 2020</w:t>
+          <w:t xml:space="preserve">Grice et al., 2020</w:t>
         </w:r>
       </w:hyperlink>
       <w:r>
@@ -1750,7 +1773,7 @@
           <w:rPr>
             <w:rStyle w:val="Hyperlink"/>
           </w:rPr>
-          <w:t xml:space="preserve">Hullman et al. 2015</w:t>
+          <w:t xml:space="preserve">Hullman et al., 2015</w:t>
         </w:r>
       </w:hyperlink>
       <w:r>
@@ -1764,7 +1787,7 @@
           <w:rPr>
             <w:rStyle w:val="Hyperlink"/>
           </w:rPr>
-          <w:t xml:space="preserve">Zhang et al. 2023</w:t>
+          <w:t xml:space="preserve">Zhang et al., 2023</w:t>
         </w:r>
       </w:hyperlink>
       <w:r>
@@ -1782,12 +1805,26 @@
       <w:r>
         <w:t xml:space="preserve"> </w:t>
       </w:r>
+      <w:hyperlink w:anchor="ref-rycroft-smith2022">
+        <w:r>
+          <w:rPr>
+            <w:rStyle w:val="Hyperlink"/>
+          </w:rPr>
+          <w:t xml:space="preserve">Rycroft-Smith &amp; Stylianides, 2022</w:t>
+        </w:r>
+      </w:hyperlink>
+      <w:r>
+        <w:t xml:space="preserve">;</w:t>
+      </w:r>
+      <w:r>
+        <w:t xml:space="preserve"> </w:t>
+      </w:r>
       <w:hyperlink w:anchor="ref-schneider2024">
         <w:r>
           <w:rPr>
             <w:rStyle w:val="Hyperlink"/>
           </w:rPr>
-          <w:t xml:space="preserve">Schneider et al. 2024</w:t>
+          <w:t xml:space="preserve">Schneider et al., 2024</w:t>
         </w:r>
       </w:hyperlink>
       <w:r>
@@ -2084,7 +2121,7 @@
     </w:p>
     <w:bookmarkEnd w:id="44"/>
     <w:bookmarkEnd w:id="45"/>
-    <w:bookmarkStart w:id="77" w:name="die-vorliegende-studie"/>
+    <w:bookmarkStart w:id="78" w:name="die-vorliegende-studie"/>
     <w:p>
       <w:pPr>
         <w:pStyle w:val="Heading1"/>
@@ -2098,24 +2135,10 @@
         <w:pStyle w:val="FirstParagraph"/>
       </w:pPr>
       <w:r>
-        <w:t xml:space="preserve">In diesem Kontext untersucht die vorliegende Studie, inwiefern verbreitete Standardgrafiken zur Kommunikation der Entwicklung der Lesekompetenz in den deutschen Kohorten des Programme of International Student Assessment (PISA) Practical Significance Bias induzieren und ob dieser mit Grafiken verringert werden kann, bei deren Gestaltung theoretische und empirische Erkenntnisse der Wissenschaftkommunikation (siehe</w:t>
-      </w:r>
-      <w:r>
-        <w:t xml:space="preserve"> </w:t>
-      </w:r>
-      <w:hyperlink w:anchor="sec-materialien">
-        <w:r>
-          <w:rPr>
-            <w:rStyle w:val="Hyperlink"/>
-          </w:rPr>
-          <w:t xml:space="preserve">Kapitel 2.1.1</w:t>
-        </w:r>
-      </w:hyperlink>
-      <w:r>
-        <w:t xml:space="preserve">) berücksichtigt wurden.</w:t>
-      </w:r>
-    </w:p>
-    <w:bookmarkStart w:id="76" w:name="methode"/>
+        <w:t xml:space="preserve">Die vorliegende Studie untersucht, inwiefern verbreitete Standardgrafiken zur Kommunikation der Entwicklung der Lesekompetenz in den deutschen Kohorten des Programme of International Student Assessment (PISA) »Practical Significance Bias«, also das automatische Annehmen starker Effekte, wenn keine Effektstärken Berichtet werden, induzieren und ob dieser mit Grafiken verringert werden kann, bei deren Gestaltung theoretische und empirische Erkenntnisse der Wissenschaftkommunikation berücksichtigt wurden.</w:t>
+      </w:r>
+    </w:p>
+    <w:bookmarkStart w:id="77" w:name="methode"/>
     <w:p>
       <w:pPr>
         <w:pStyle w:val="Heading2"/>
@@ -2165,7 +2188,7 @@
           <w:rPr>
             <w:rStyle w:val="Hyperlink"/>
           </w:rPr>
-          <w:t xml:space="preserve">Döring und Bortz 2016</w:t>
+          <w:t xml:space="preserve">Döring &amp; Bortz, 2016</w:t>
         </w:r>
       </w:hyperlink>
       <w:r>
@@ -2379,8 +2402,10 @@
               <w:r>
                 <w:rPr>
                   <w:rStyle w:val="Hyperlink"/>
+                  <w:b/>
+                  <w:bCs/>
                 </w:rPr>
-                <w:t xml:space="preserve">2023</w:t>
+                <w:t xml:space="preserve">oecd2023a?</w:t>
               </w:r>
             </w:hyperlink>
             <w:r>
@@ -2452,7 +2477,7 @@
         <w:pStyle w:val="AfterWithoutNote"/>
       </w:pPr>
       <w:r>
-        <w:t xml:space="preserve">Diese Abbildungen erlauben einen effizienten Vergleich der Mittelwerte sowohl über die Zeit als auch Variablen (hier: Fächer) hinweg. In solchen Grafiken ist jedoch die Bedeutsamkeit der Mittelwertsdifferenz nur bei bekannter Streuung interpretierbar:</w:t>
+        <w:t xml:space="preserve">Diese Abbildungen erlauben einen effizienten Vergleich der Mittelwerte sowohl über die Zeit als auch über Variablen (hier: Fächer) hinweg. In solchen Grafiken ist jedoch die Bedeutsamkeit der Mittelwertsdifferenz nur bei bekannter Streuung interpretierbar:</w:t>
       </w:r>
       <w:r>
         <w:t xml:space="preserve"> </w:t>
@@ -2469,7 +2494,7 @@
         <w:t xml:space="preserve"> </w:t>
       </w:r>
       <w:r>
-        <w:t xml:space="preserve">zeigt jeweils die gleichen Mittelwerte von 508 (PISA Lesen 2015) und 480 (PISA Lesen 2022).</w:t>
+        <w:t xml:space="preserve">zeigt jeweils die gleichen Mittelwerte von 508 (PISA Lesen 2015) und 480 (PISA Lesen 2022) bei unterschiedlichen Streuungen.</w:t>
       </w:r>
     </w:p>
     <w:bookmarkStart w:id="60" w:name="cell-fig-mwdiffstreuung"/>
@@ -2600,7 +2625,7 @@
           <w:rPr>
             <w:rStyle w:val="Hyperlink"/>
           </w:rPr>
-          <w:t xml:space="preserve">Kale et al. 2021</w:t>
+          <w:t xml:space="preserve">Kale et al., 2021</w:t>
         </w:r>
       </w:hyperlink>
       <w:r>
@@ -2760,7 +2785,7 @@
           <w:rPr>
             <w:rStyle w:val="Hyperlink"/>
           </w:rPr>
-          <w:t xml:space="preserve">Garnier et al. 2023</w:t>
+          <w:t xml:space="preserve">Garnier et al., 2024</w:t>
         </w:r>
       </w:hyperlink>
       <w:r>
@@ -2780,7 +2805,7 @@
           <w:rPr>
             <w:rStyle w:val="Hyperlink"/>
           </w:rPr>
-          <w:t xml:space="preserve">Franconeri et al. 2021</w:t>
+          <w:t xml:space="preserve">Franconeri et al., 2021</w:t>
         </w:r>
       </w:hyperlink>
       <w:r>
@@ -2950,7 +2975,7 @@
           <w:rPr>
             <w:rStyle w:val="Hyperlink"/>
           </w:rPr>
-          <w:t xml:space="preserve">Brooks et al. 2014</w:t>
+          <w:t xml:space="preserve">Brooks et al., 2014</w:t>
         </w:r>
       </w:hyperlink>
       <w:r>
@@ -2964,7 +2989,7 @@
           <w:rPr>
             <w:rStyle w:val="Hyperlink"/>
           </w:rPr>
-          <w:t xml:space="preserve">Kim et al. 2022</w:t>
+          <w:t xml:space="preserve">Kim et al., 2022</w:t>
         </w:r>
       </w:hyperlink>
       <w:r>
@@ -3016,7 +3041,7 @@
           <w:rPr>
             <w:rStyle w:val="Hyperlink"/>
           </w:rPr>
-          <w:t xml:space="preserve">Frischkorn und Popov 2023</w:t>
+          <w:t xml:space="preserve">Frischkorn &amp; Popov, 2023</w:t>
         </w:r>
       </w:hyperlink>
       <w:r>
@@ -3039,7 +3064,7 @@
           <w:rPr>
             <w:rStyle w:val="Hyperlink"/>
           </w:rPr>
-          <w:t xml:space="preserve">Stan Development Team 2024</w:t>
+          <w:t xml:space="preserve">Stan Development Team, 2024</w:t>
         </w:r>
       </w:hyperlink>
       <w:r>
@@ -3062,7 +3087,7 @@
           <w:rPr>
             <w:rStyle w:val="Hyperlink"/>
           </w:rPr>
-          <w:t xml:space="preserve">Bürkner 2017</w:t>
+          <w:t xml:space="preserve">Bürkner, 2017</w:t>
         </w:r>
       </w:hyperlink>
       <w:r>
@@ -3246,7 +3271,7 @@
           <w:rPr>
             <w:rStyle w:val="Hyperlink"/>
           </w:rPr>
-          <w:t xml:space="preserve">Vehtari et al. 2021</w:t>
+          <w:t xml:space="preserve">Vehtari et al., 2021</w:t>
         </w:r>
       </w:hyperlink>
       <w:r>
@@ -3370,13 +3395,31 @@
         <w:t xml:space="preserve"> </w:t>
       </w:r>
       <w:r>
-        <w:t xml:space="preserve">= 0.23) oder anders ausgedrückt: Legt man 100 mal einem:einer Studierenden die Originalgrafik und einem:einer Studierenden die Überlappungsgrafik vor, schätzt 61mal die:der Studierende mit der Überlappungsgrafik den Effekt weniger verzerrt ein. Die Inferenzstatistik für diesen Unterschied ist mit einer Evidence Ratio von 14.8 klar konklusiv: Die Alternativhypothese einer kleineren Probability of Superiority für die Überlappungsgrafik ist gegeben die Daten 14,8-fach wahrscheinlicher als die Nullhypothese einer größeren Probability of Superiority.</w:t>
+        <w:t xml:space="preserve">= 0.23) oder anders ausgedrückt: Legt man 100 mal einem:einer Studierenden die Originalgrafik und einem:einer Studierenden die Überlappungsgrafik vor, schätzt 61mal die:der Studierende mit der Überlappungsgrafik den Effekt weniger verzerrt ein. Die Inferenzstatistik für diesen Unterschied ist mit einer Evidence Ratio von 14.8 klar konklusiv: Die Alternativhypothese einer kleineren Probability of Superiority für die Überlappungsgrafik ist gegeben die Daten 14,8-fach wahrscheinlicher (als die Nullhypothese einer größeren Probability of Superiority).</w:t>
       </w:r>
     </w:p>
     <w:bookmarkEnd w:id="75"/>
+    <w:bookmarkStart w:id="76" w:name="limitationen"/>
+    <w:p>
+      <w:pPr>
+        <w:pStyle w:val="Heading3"/>
+      </w:pPr>
+      <w:r>
+        <w:t xml:space="preserve">Limitationen</w:t>
+      </w:r>
+    </w:p>
+    <w:p>
+      <w:pPr>
+        <w:pStyle w:val="FirstParagraph"/>
+      </w:pPr>
+      <w:r>
+        <w:t xml:space="preserve">Die vorgestellte Studie stellt lediglich ein kleines Experiment an einer selektiven Gelegenheitsstichprobe ohne Präregistrierung dar. Interne und ökologische Validität konnten aufgrund des experimentellen Designs mit realweltlichen Materialien dennoch gestärkt werden. Die externe und Konstruktvalidität litt jedoch sicher an der großen Homogenität und Spezifität der Stichprobe, sehr spezifisch gewähltem Kontext (PISA Lesekompetenz) sowie theoretisch etwas arbiträren unabhängigen Variablen (viele weitere Gestaltungsprinzipien wären denkbar). Zudem wären weitere abhängige Variablen wie Einstellungen und Überzeugungen wünschenswert.</w:t>
+      </w:r>
+    </w:p>
     <w:bookmarkEnd w:id="76"/>
     <w:bookmarkEnd w:id="77"/>
-    <w:bookmarkStart w:id="188" w:name="diskussion"/>
+    <w:bookmarkEnd w:id="78"/>
+    <w:bookmarkStart w:id="191" w:name="diskussion"/>
     <w:p>
       <w:pPr>
         <w:pStyle w:val="Heading1"/>
@@ -3390,7 +3433,7 @@
         <w:pStyle w:val="FirstParagraph"/>
       </w:pPr>
       <w:r>
-        <w:t xml:space="preserve">Der vorliegende Beitrag zielt darauf ab, zu eruieren, inwiefern es nach dem Stand der Forschung gestaltete Wissenschaftskommunikation ermöglicht, bildungswissenschaftliche und fachdidaktische Evidenz »besser« an Lehrkräfte zu kommunizieren. Dabei wurde »besser« als »weniger gebiased« operationalisiert und gezeigt, dass die Wahl einer theoretisch fundierten grafischen Darstellung einen deutlich geringeren Bias induzierte als eine Standardgrafik. Allerdings war auch die Rezeption der verbesserten Darstellung immer noch erheblich verzerrt (siehe</w:t>
+        <w:t xml:space="preserve">Der vorliegende Beitrag zielt darauf ab, zu eruieren, inwiefern es nach dem Stand der Forschung gestaltete Wissenschaftskommunikation ermöglicht, Evidenz »besser« an Lehramtsstudierende und Lehrkräfte zu kommunizieren. Dabei wurde »besser« als »weniger gebiased« operationalisiert und gezeigt, dass die Wahl einer theoretisch fundierten grafischen Darstellung einen deutlich geringeren Bias induzierte als eine Standardgrafik. Allerdings war auch die Rezeption der verbesserten Darstellung immer noch erheblich verzerrt (siehe</w:t>
       </w:r>
       <w:r>
         <w:t xml:space="preserve"> </w:t>
@@ -3436,7 +3479,7 @@
           <w:rPr>
             <w:rStyle w:val="Hyperlink"/>
           </w:rPr>
-          <w:t xml:space="preserve">Mitchell und Jolley 2010</w:t>
+          <w:t xml:space="preserve">Mitchell &amp; Jolley, 2010</w:t>
         </w:r>
       </w:hyperlink>
       <w:r>
@@ -3462,7 +3505,7 @@
           <w:rPr>
             <w:rStyle w:val="Hyperlink"/>
           </w:rPr>
-          <w:t xml:space="preserve">Bohl et al. 2015</w:t>
+          <w:t xml:space="preserve">Bohl et al., 2015</w:t>
         </w:r>
       </w:hyperlink>
       <w:r>
@@ -3476,7 +3519,7 @@
           <w:rPr>
             <w:rStyle w:val="Hyperlink"/>
           </w:rPr>
-          <w:t xml:space="preserve">Dewe et al. 1992</w:t>
+          <w:t xml:space="preserve">Dewe et al., 1992</w:t>
         </w:r>
       </w:hyperlink>
       <w:r>
@@ -3502,7 +3545,7 @@
           <w:rPr>
             <w:rStyle w:val="Hyperlink"/>
           </w:rPr>
-          <w:t xml:space="preserve">Groß Ophoff et al. 2023</w:t>
+          <w:t xml:space="preserve">Groß Ophoff et al., 2023</w:t>
         </w:r>
       </w:hyperlink>
       <w:r>
@@ -3540,7 +3583,7 @@
         <w:t xml:space="preserve"> </w:t>
       </w:r>
       <w:r>
-        <w:t xml:space="preserve">die Verwendung von Effektstärken fordern, diese aber in Pressemitteilungen (etwa der American Educational Research Association) und selbst in Fachzeitschriften selten sind, obwohl die Fachgesellschaften bzw. Zeitschriften diese in ihren Autor:innenrichtlinien verbindlich fordern</w:t>
+        <w:t xml:space="preserve">die Verwendung von Effektstärken fordern, diese aber in Pressemitteilungen (etwa der American Educational Research Association) und selbst in Fachzeitschriften selten sind</w:t>
       </w:r>
       <w:r>
         <w:t xml:space="preserve"> </w:t>
@@ -3553,7 +3596,7 @@
           <w:rPr>
             <w:rStyle w:val="Hyperlink"/>
           </w:rPr>
-          <w:t xml:space="preserve">McMillan und Jennifer 2011</w:t>
+          <w:t xml:space="preserve">McMillan &amp; Jennifer, 2011</w:t>
         </w:r>
       </w:hyperlink>
       <w:r>
@@ -3624,7 +3667,7 @@
           <w:rPr>
             <w:rStyle w:val="Hyperlink"/>
           </w:rPr>
-          <w:t xml:space="preserve">McDowell und Jacobs 2017</w:t>
+          <w:t xml:space="preserve">McDowell &amp; Jacobs, 2017</w:t>
         </w:r>
       </w:hyperlink>
       <w:r>
@@ -3644,7 +3687,7 @@
           <w:rPr>
             <w:rStyle w:val="Hyperlink"/>
           </w:rPr>
-          <w:t xml:space="preserve">Gigerenzer et al. 2005</w:t>
+          <w:t xml:space="preserve">Gigerenzer et al., 2005</w:t>
         </w:r>
       </w:hyperlink>
       <w:r>
@@ -3672,7 +3715,7 @@
           <w:rPr>
             <w:rStyle w:val="Hyperlink"/>
           </w:rPr>
-          <w:t xml:space="preserve">Brühwiler und Leutwyler 2020</w:t>
+          <w:t xml:space="preserve">Brühwiler &amp; Leutwyler, 2020</w:t>
         </w:r>
       </w:hyperlink>
       <w:r>
@@ -3695,7 +3738,7 @@
           <w:rPr>
             <w:rStyle w:val="Hyperlink"/>
           </w:rPr>
-          <w:t xml:space="preserve">Schmidt 2024</w:t>
+          <w:t xml:space="preserve">Schmidt, 2024</w:t>
         </w:r>
       </w:hyperlink>
       <w:r>
@@ -3773,7 +3816,7 @@
           <w:rPr>
             <w:rStyle w:val="Hyperlink"/>
           </w:rPr>
-          <w:t xml:space="preserve">Leitz et al. 2024</w:t>
+          <w:t xml:space="preserve">Leitz et al., 2024</w:t>
         </w:r>
       </w:hyperlink>
       <w:r>
@@ -3783,7 +3826,7 @@
         <w:t xml:space="preserve">.</w:t>
       </w:r>
     </w:p>
-    <w:bookmarkStart w:id="187" w:name="literatur"/>
+    <w:bookmarkStart w:id="190" w:name="literatur"/>
     <w:p>
       <w:pPr>
         <w:pStyle w:val="Heading2"/>
@@ -3792,8 +3835,8 @@
         <w:t xml:space="preserve">Literatur</w:t>
       </w:r>
     </w:p>
-    <w:bookmarkStart w:id="186" w:name="refs"/>
-    <w:bookmarkStart w:id="79" w:name="ref-aero2023"/>
+    <w:bookmarkStart w:id="189" w:name="refs"/>
+    <w:bookmarkStart w:id="80" w:name="ref-aero2023"/>
     <w:p>
       <w:pPr>
         <w:pStyle w:val="Bibliography"/>
@@ -3809,7 +3852,7 @@
           <w:i/>
           <w:iCs/>
         </w:rPr>
-        <w:t xml:space="preserve">Evidence-Based Teaching Practices</w:t>
+        <w:t xml:space="preserve">Evidence-based teaching practices</w:t>
       </w:r>
       <w:r>
         <w:t xml:space="preserve">. Australian Education Research Organisation.</w:t>
@@ -3817,7 +3860,7 @@
       <w:r>
         <w:t xml:space="preserve"> </w:t>
       </w:r>
-      <w:hyperlink r:id="rId78">
+      <w:hyperlink r:id="rId79">
         <w:r>
           <w:rPr>
             <w:rStyle w:val="Hyperlink"/>
@@ -3826,8 +3869,8 @@
         </w:r>
       </w:hyperlink>
     </w:p>
-    <w:bookmarkEnd w:id="79"/>
-    <w:bookmarkStart w:id="80" w:name="ref-altrichter2006"/>
+    <w:bookmarkEnd w:id="80"/>
+    <w:bookmarkStart w:id="81" w:name="ref-altrichter2006"/>
     <w:p>
       <w:pPr>
         <w:pStyle w:val="Bibliography"/>
@@ -3862,8 +3905,8 @@
         <w:t xml:space="preserve">(4), 4–6.</w:t>
       </w:r>
     </w:p>
-    <w:bookmarkEnd w:id="80"/>
-    <w:bookmarkStart w:id="81" w:name="ref-americanpsychologicalassociation2019"/>
+    <w:bookmarkEnd w:id="81"/>
+    <w:bookmarkStart w:id="82" w:name="ref-americanpsychologicalassociation2019"/>
     <w:p>
       <w:pPr>
         <w:pStyle w:val="Bibliography"/>
@@ -3879,7 +3922,7 @@
           <w:i/>
           <w:iCs/>
         </w:rPr>
-        <w:t xml:space="preserve">Publication Manual of the American Psychological Association</w:t>
+        <w:t xml:space="preserve">Publication manual of the American Psychological Association</w:t>
       </w:r>
       <w:r>
         <w:t xml:space="preserve"> </w:t>
@@ -3888,8 +3931,8 @@
         <w:t xml:space="preserve">(7. Aufl.). American Psychological Association.</w:t>
       </w:r>
     </w:p>
-    <w:bookmarkEnd w:id="81"/>
-    <w:bookmarkStart w:id="83" w:name="ref-bauer2012"/>
+    <w:bookmarkEnd w:id="82"/>
+    <w:bookmarkStart w:id="84" w:name="ref-bauer2012"/>
     <w:p>
       <w:pPr>
         <w:pStyle w:val="Bibliography"/>
@@ -3926,7 +3969,7 @@
       <w:r>
         <w:t xml:space="preserve"> </w:t>
       </w:r>
-      <w:hyperlink r:id="rId82">
+      <w:hyperlink r:id="rId83">
         <w:r>
           <w:rPr>
             <w:rStyle w:val="Hyperlink"/>
@@ -3935,18 +3978,34 @@
         </w:r>
       </w:hyperlink>
     </w:p>
-    <w:bookmarkEnd w:id="83"/>
-    <w:bookmarkStart w:id="84" w:name="ref-bauer1978"/>
+    <w:bookmarkEnd w:id="84"/>
+    <w:bookmarkStart w:id="85" w:name="ref-bauer1978"/>
     <w:p>
       <w:pPr>
         <w:pStyle w:val="Bibliography"/>
       </w:pPr>
       <w:r>
-        <w:t xml:space="preserve">Bauer, K.-O., &amp; Rolff, H.-G. (1978). Vorarbeiten zu einer Theorie der Schulentwicklung. In K.-O. Bauer &amp; H.-G. Rolff (Hrsg.), (S. 219–263). Weinheim und Basel: Beltz.</w:t>
-      </w:r>
-    </w:p>
-    <w:bookmarkEnd w:id="84"/>
-    <w:bookmarkStart w:id="86" w:name="ref-bez2021"/>
+        <w:t xml:space="preserve">Bauer, K.-O., &amp; Rolff, H.-G. (1978).</w:t>
+      </w:r>
+      <w:r>
+        <w:t xml:space="preserve"> </w:t>
+      </w:r>
+      <w:r>
+        <w:rPr>
+          <w:i/>
+          <w:iCs/>
+        </w:rPr>
+        <w:t xml:space="preserve">Vorarbeiten zu einer Theorie der Schulentwicklung</w:t>
+      </w:r>
+      <w:r>
+        <w:t xml:space="preserve"> </w:t>
+      </w:r>
+      <w:r>
+        <w:t xml:space="preserve">(K.-O. Bauer &amp; H.-G. Rolff, Hrsg.; S. 219–263). Beltz.</w:t>
+      </w:r>
+    </w:p>
+    <w:bookmarkEnd w:id="85"/>
+    <w:bookmarkStart w:id="87" w:name="ref-bez2021"/>
     <w:p>
       <w:pPr>
         <w:pStyle w:val="Bibliography"/>
@@ -3983,7 +4042,7 @@
       <w:r>
         <w:t xml:space="preserve"> </w:t>
       </w:r>
-      <w:hyperlink r:id="rId85">
+      <w:hyperlink r:id="rId86">
         <w:r>
           <w:rPr>
             <w:rStyle w:val="Hyperlink"/>
@@ -3992,19 +4051,35 @@
         </w:r>
       </w:hyperlink>
     </w:p>
-    <w:bookmarkEnd w:id="86"/>
-    <w:bookmarkStart w:id="88" w:name="ref-bohl2020"/>
+    <w:bookmarkEnd w:id="87"/>
+    <w:bookmarkStart w:id="89" w:name="ref-bohl2020"/>
     <w:p>
       <w:pPr>
         <w:pStyle w:val="Bibliography"/>
       </w:pPr>
       <w:r>
-        <w:t xml:space="preserve">Bohl, T. (2020). Theorien der Schulentwicklung. In M. Harant, P. Thomas, &amp; U. Küchler (Hrsg.), (S. 97–109). Tübingen: Tübingen University Press.</w:t>
-      </w:r>
-      <w:r>
-        <w:t xml:space="preserve"> </w:t>
-      </w:r>
-      <w:hyperlink r:id="rId87">
+        <w:t xml:space="preserve">Bohl, T. (2020).</w:t>
+      </w:r>
+      <w:r>
+        <w:t xml:space="preserve"> </w:t>
+      </w:r>
+      <w:r>
+        <w:rPr>
+          <w:i/>
+          <w:iCs/>
+        </w:rPr>
+        <w:t xml:space="preserve">Theorien der Schulentwicklung</w:t>
+      </w:r>
+      <w:r>
+        <w:t xml:space="preserve"> </w:t>
+      </w:r>
+      <w:r>
+        <w:t xml:space="preserve">(M. Harant, P. Thomas, &amp; U. Küchler, Hrsg.; S. 97–109). Tübingen University Press.</w:t>
+      </w:r>
+      <w:r>
+        <w:t xml:space="preserve"> </w:t>
+      </w:r>
+      <w:hyperlink r:id="rId88">
         <w:r>
           <w:rPr>
             <w:rStyle w:val="Hyperlink"/>
@@ -4013,8 +4088,8 @@
         </w:r>
       </w:hyperlink>
     </w:p>
-    <w:bookmarkEnd w:id="88"/>
-    <w:bookmarkStart w:id="90" w:name="ref-bohl2015a"/>
+    <w:bookmarkEnd w:id="89"/>
+    <w:bookmarkStart w:id="91" w:name="ref-bohl2015a"/>
     <w:p>
       <w:pPr>
         <w:pStyle w:val="Bibliography"/>
@@ -4036,12 +4111,12 @@
         <w:t xml:space="preserve"> </w:t>
       </w:r>
       <w:r>
-        <w:t xml:space="preserve">(1. Aufl.). Stuttgart: UTB GmbH.</w:t>
-      </w:r>
-      <w:r>
-        <w:t xml:space="preserve"> </w:t>
-      </w:r>
-      <w:hyperlink r:id="rId89">
+        <w:t xml:space="preserve">(1. Aufl). utb.</w:t>
+      </w:r>
+      <w:r>
+        <w:t xml:space="preserve"> </w:t>
+      </w:r>
+      <w:hyperlink r:id="rId90">
         <w:r>
           <w:rPr>
             <w:rStyle w:val="Hyperlink"/>
@@ -4050,8 +4125,8 @@
         </w:r>
       </w:hyperlink>
     </w:p>
-    <w:bookmarkEnd w:id="90"/>
-    <w:bookmarkStart w:id="91" w:name="ref-bohrer2025"/>
+    <w:bookmarkEnd w:id="91"/>
+    <w:bookmarkStart w:id="92" w:name="ref-bohrer2025"/>
     <w:p>
       <w:pPr>
         <w:pStyle w:val="Bibliography"/>
@@ -4073,8 +4148,8 @@
         <w:t xml:space="preserve">.</w:t>
       </w:r>
     </w:p>
-    <w:bookmarkEnd w:id="91"/>
-    <w:bookmarkStart w:id="93" w:name="ref-bromme2014e"/>
+    <w:bookmarkEnd w:id="92"/>
+    <w:bookmarkStart w:id="94" w:name="ref-bromme2014e"/>
     <w:p>
       <w:pPr>
         <w:pStyle w:val="Bibliography"/>
@@ -4111,7 +4186,7 @@
       <w:r>
         <w:t xml:space="preserve"> </w:t>
       </w:r>
-      <w:hyperlink r:id="rId92">
+      <w:hyperlink r:id="rId93">
         <w:r>
           <w:rPr>
             <w:rStyle w:val="Hyperlink"/>
@@ -4120,8 +4195,8 @@
         </w:r>
       </w:hyperlink>
     </w:p>
-    <w:bookmarkEnd w:id="93"/>
-    <w:bookmarkStart w:id="95" w:name="ref-brooks2014"/>
+    <w:bookmarkEnd w:id="94"/>
+    <w:bookmarkStart w:id="96" w:name="ref-brooks2014"/>
     <w:p>
       <w:pPr>
         <w:pStyle w:val="Bibliography"/>
@@ -4158,7 +4233,7 @@
       <w:r>
         <w:t xml:space="preserve"> </w:t>
       </w:r>
-      <w:hyperlink r:id="rId94">
+      <w:hyperlink r:id="rId95">
         <w:r>
           <w:rPr>
             <w:rStyle w:val="Hyperlink"/>
@@ -4167,19 +4242,35 @@
         </w:r>
       </w:hyperlink>
     </w:p>
-    <w:bookmarkEnd w:id="95"/>
-    <w:bookmarkStart w:id="97" w:name="ref-bruegelmann2018"/>
+    <w:bookmarkEnd w:id="96"/>
+    <w:bookmarkStart w:id="98" w:name="ref-bruegelmann2018"/>
     <w:p>
       <w:pPr>
         <w:pStyle w:val="Bibliography"/>
       </w:pPr>
       <w:r>
-        <w:t xml:space="preserve">Brügelmann, H. (2018). Unterrichts- und Schulentwicklung in Communities of Practice. In H. Barz (Hrsg.), (S. 479–484). Wiesbaden: Springer Fachmedien.</w:t>
-      </w:r>
-      <w:r>
-        <w:t xml:space="preserve"> </w:t>
-      </w:r>
-      <w:hyperlink r:id="rId96">
+        <w:t xml:space="preserve">Brügelmann, H. (2018).</w:t>
+      </w:r>
+      <w:r>
+        <w:t xml:space="preserve"> </w:t>
+      </w:r>
+      <w:r>
+        <w:rPr>
+          <w:i/>
+          <w:iCs/>
+        </w:rPr>
+        <w:t xml:space="preserve">Unterrichts- und Schulentwicklung in Communities of Practice</w:t>
+      </w:r>
+      <w:r>
+        <w:t xml:space="preserve"> </w:t>
+      </w:r>
+      <w:r>
+        <w:t xml:space="preserve">(H. Barz, Hrsg.; S. 479–484). Springer Fachmedien.</w:t>
+      </w:r>
+      <w:r>
+        <w:t xml:space="preserve"> </w:t>
+      </w:r>
+      <w:hyperlink r:id="rId97">
         <w:r>
           <w:rPr>
             <w:rStyle w:val="Hyperlink"/>
@@ -4188,8 +4279,8 @@
         </w:r>
       </w:hyperlink>
     </w:p>
-    <w:bookmarkEnd w:id="97"/>
-    <w:bookmarkStart w:id="99" w:name="ref-bruhwiler2020"/>
+    <w:bookmarkEnd w:id="98"/>
+    <w:bookmarkStart w:id="100" w:name="ref-bruhwiler2020"/>
     <w:p>
       <w:pPr>
         <w:pStyle w:val="Bibliography"/>
@@ -4226,7 +4317,7 @@
       <w:r>
         <w:t xml:space="preserve"> </w:t>
       </w:r>
-      <w:hyperlink r:id="rId98">
+      <w:hyperlink r:id="rId99">
         <w:r>
           <w:rPr>
             <w:rStyle w:val="Hyperlink"/>
@@ -4235,14 +4326,14 @@
         </w:r>
       </w:hyperlink>
     </w:p>
-    <w:bookmarkEnd w:id="99"/>
-    <w:bookmarkStart w:id="101" w:name="ref-bürkner2017"/>
+    <w:bookmarkEnd w:id="100"/>
+    <w:bookmarkStart w:id="102" w:name="ref-bürkner2017"/>
     <w:p>
       <w:pPr>
         <w:pStyle w:val="Bibliography"/>
       </w:pPr>
       <w:r>
-        <w:t xml:space="preserve">Bürkner, P.-C. (2017). brms: An R Package for Bayesian Multilevel Models Using Stan.</w:t>
+        <w:t xml:space="preserve">Bürkner, P.-C. (2017). brms: An R package for bayesian multilevel models using stan.</w:t>
       </w:r>
       <w:r>
         <w:t xml:space="preserve"> </w:t>
@@ -4268,12 +4359,12 @@
         <w:t xml:space="preserve">80</w:t>
       </w:r>
       <w:r>
-        <w:t xml:space="preserve">(1).</w:t>
-      </w:r>
-      <w:r>
-        <w:t xml:space="preserve"> </w:t>
-      </w:r>
-      <w:hyperlink r:id="rId100">
+        <w:t xml:space="preserve">(1), 1–28.</w:t>
+      </w:r>
+      <w:r>
+        <w:t xml:space="preserve"> </w:t>
+      </w:r>
+      <w:hyperlink r:id="rId101">
         <w:r>
           <w:rPr>
             <w:rStyle w:val="Hyperlink"/>
@@ -4282,19 +4373,32 @@
         </w:r>
       </w:hyperlink>
     </w:p>
-    <w:bookmarkEnd w:id="101"/>
-    <w:bookmarkStart w:id="103" w:name="ref-zotero-8935"/>
+    <w:bookmarkEnd w:id="102"/>
+    <w:bookmarkStart w:id="104" w:name="ref-zotero-8935"/>
     <w:p>
       <w:pPr>
         <w:pStyle w:val="Bibliography"/>
       </w:pPr>
       <w:r>
-        <w:t xml:space="preserve">Clearing House Unterricht Academy. (2025). Clearing House Unterricht Academy.</w:t>
-      </w:r>
-      <w:r>
-        <w:t xml:space="preserve"> </w:t>
-      </w:r>
-      <w:hyperlink r:id="rId102">
+        <w:t xml:space="preserve">Clearing House Unterricht Academy. (2025).</w:t>
+      </w:r>
+      <w:r>
+        <w:t xml:space="preserve"> </w:t>
+      </w:r>
+      <w:r>
+        <w:rPr>
+          <w:i/>
+          <w:iCs/>
+        </w:rPr>
+        <w:t xml:space="preserve">Clearing House Unterricht Academy</w:t>
+      </w:r>
+      <w:r>
+        <w:t xml:space="preserve">.</w:t>
+      </w:r>
+      <w:r>
+        <w:t xml:space="preserve"> </w:t>
+      </w:r>
+      <w:hyperlink r:id="rId103">
         <w:r>
           <w:rPr>
             <w:rStyle w:val="Hyperlink"/>
@@ -4302,23 +4406,33 @@
           <w:t xml:space="preserve">https://clearinghouse-academy.de/</w:t>
         </w:r>
       </w:hyperlink>
-      <w:r>
-        <w:t xml:space="preserve">. Zugegriffen: 23. Januar 2025</w:t>
-      </w:r>
-    </w:p>
-    <w:bookmarkEnd w:id="103"/>
-    <w:bookmarkStart w:id="105" w:name="ref-eurlex2024"/>
+    </w:p>
+    <w:bookmarkEnd w:id="104"/>
+    <w:bookmarkStart w:id="106" w:name="ref-eurlex2024"/>
     <w:p>
       <w:pPr>
         <w:pStyle w:val="Bibliography"/>
       </w:pPr>
       <w:r>
-        <w:t xml:space="preserve">Council of the European Union. (2024). Council conclusions on promoting evidence-informed policy and practice in education and training to achieve the European Education Area.</w:t>
-      </w:r>
-      <w:r>
-        <w:t xml:space="preserve"> </w:t>
-      </w:r>
-      <w:hyperlink r:id="rId104">
+        <w:t xml:space="preserve">Council of the European Union. (2024).</w:t>
+      </w:r>
+      <w:r>
+        <w:t xml:space="preserve"> </w:t>
+      </w:r>
+      <w:r>
+        <w:rPr>
+          <w:i/>
+          <w:iCs/>
+        </w:rPr>
+        <w:t xml:space="preserve">Council conclusions on promoting evidence-informed policy and practice in education and training to achieve the European Education Area</w:t>
+      </w:r>
+      <w:r>
+        <w:t xml:space="preserve">.</w:t>
+      </w:r>
+      <w:r>
+        <w:t xml:space="preserve"> </w:t>
+      </w:r>
+      <w:hyperlink r:id="rId105">
         <w:r>
           <w:rPr>
             <w:rStyle w:val="Hyperlink"/>
@@ -4327,37 +4441,77 @@
         </w:r>
       </w:hyperlink>
     </w:p>
-    <w:bookmarkEnd w:id="105"/>
-    <w:bookmarkStart w:id="107" w:name="ref-dewe1992"/>
+    <w:bookmarkEnd w:id="106"/>
+    <w:bookmarkStart w:id="108" w:name="ref-dewe1992"/>
     <w:p>
       <w:pPr>
         <w:pStyle w:val="Bibliography"/>
       </w:pPr>
       <w:r>
-        <w:t xml:space="preserve">Dewe, B., Ferchhoff, W., &amp; Radtke, F.-O. (1992). Das</w:t>
-      </w:r>
-      <w:r>
-        <w:t xml:space="preserve"> </w:t>
-      </w:r>
-      <w:r>
+        <w:t xml:space="preserve">Dewe, B., Ferchhoff, W., &amp; Radtke, F.-O. (1992).</w:t>
+      </w:r>
+      <w:r>
+        <w:t xml:space="preserve"> </w:t>
+      </w:r>
+      <w:r>
+        <w:rPr>
+          <w:i/>
+          <w:iCs/>
+        </w:rPr>
+        <w:t xml:space="preserve">Das</w:t>
+      </w:r>
+      <w:r>
+        <w:rPr>
+          <w:i/>
+          <w:iCs/>
+        </w:rPr>
+        <w:t xml:space="preserve"> </w:t>
+      </w:r>
+      <w:r>
+        <w:rPr>
+          <w:i/>
+          <w:iCs/>
+        </w:rPr>
         <w:t xml:space="preserve">,,</w:t>
       </w:r>
       <w:r>
+        <w:rPr>
+          <w:i/>
+          <w:iCs/>
+        </w:rPr>
         <w:t xml:space="preserve">Professionswissen</w:t>
       </w:r>
       <w:r>
+        <w:rPr>
+          <w:i/>
+          <w:iCs/>
+        </w:rPr>
         <w:t xml:space="preserve">“</w:t>
       </w:r>
       <w:r>
-        <w:t xml:space="preserve"> </w:t>
-      </w:r>
-      <w:r>
-        <w:t xml:space="preserve">von Pädagogen. In B. Dewe, W. Ferchhoff, &amp; F. Olaf-Radtke (Hrsg.), (S. 70–91). Wiesbaden: VS Verlag für Sozialwissenschaften.</w:t>
-      </w:r>
-      <w:r>
-        <w:t xml:space="preserve"> </w:t>
-      </w:r>
-      <w:hyperlink r:id="rId106">
+        <w:rPr>
+          <w:i/>
+          <w:iCs/>
+        </w:rPr>
+        <w:t xml:space="preserve"> </w:t>
+      </w:r>
+      <w:r>
+        <w:rPr>
+          <w:i/>
+          <w:iCs/>
+        </w:rPr>
+        <w:t xml:space="preserve">von Pädagogen</w:t>
+      </w:r>
+      <w:r>
+        <w:t xml:space="preserve"> </w:t>
+      </w:r>
+      <w:r>
+        <w:t xml:space="preserve">(B. Dewe, W. Ferchhoff, &amp; F. Olaf-Radtke, Hrsg.; S. 70–91). Springer VS.</w:t>
+      </w:r>
+      <w:r>
+        <w:t xml:space="preserve"> </w:t>
+      </w:r>
+      <w:hyperlink r:id="rId107">
         <w:r>
           <w:rPr>
             <w:rStyle w:val="Hyperlink"/>
@@ -4366,8 +4520,8 @@
         </w:r>
       </w:hyperlink>
     </w:p>
-    <w:bookmarkEnd w:id="107"/>
-    <w:bookmarkStart w:id="109" w:name="ref-döring2016"/>
+    <w:bookmarkEnd w:id="108"/>
+    <w:bookmarkStart w:id="110" w:name="ref-döring2016"/>
     <w:p>
       <w:pPr>
         <w:pStyle w:val="Bibliography"/>
@@ -4389,12 +4543,12 @@
         <w:t xml:space="preserve"> </w:t>
       </w:r>
       <w:r>
-        <w:t xml:space="preserve">(5. Aufl.). Berlin, Heidelberg: Springer.</w:t>
-      </w:r>
-      <w:r>
-        <w:t xml:space="preserve"> </w:t>
-      </w:r>
-      <w:hyperlink r:id="rId108">
+        <w:t xml:space="preserve">(5. Aufl.). Springer.</w:t>
+      </w:r>
+      <w:r>
+        <w:t xml:space="preserve"> </w:t>
+      </w:r>
+      <w:hyperlink r:id="rId109">
         <w:r>
           <w:rPr>
             <w:rStyle w:val="Hyperlink"/>
@@ -4403,8 +4557,8 @@
         </w:r>
       </w:hyperlink>
     </w:p>
-    <w:bookmarkEnd w:id="109"/>
-    <w:bookmarkStart w:id="111" w:name="ref-franconeri2021"/>
+    <w:bookmarkEnd w:id="110"/>
+    <w:bookmarkStart w:id="112" w:name="ref-franconeri2021"/>
     <w:p>
       <w:pPr>
         <w:pStyle w:val="Bibliography"/>
@@ -4441,7 +4595,7 @@
       <w:r>
         <w:t xml:space="preserve"> </w:t>
       </w:r>
-      <w:hyperlink r:id="rId110">
+      <w:hyperlink r:id="rId111">
         <w:r>
           <w:rPr>
             <w:rStyle w:val="Hyperlink"/>
@@ -4450,8 +4604,8 @@
         </w:r>
       </w:hyperlink>
     </w:p>
-    <w:bookmarkEnd w:id="111"/>
-    <w:bookmarkStart w:id="113" w:name="ref-friel2001"/>
+    <w:bookmarkEnd w:id="112"/>
+    <w:bookmarkStart w:id="114" w:name="ref-friel2001"/>
     <w:p>
       <w:pPr>
         <w:pStyle w:val="Bibliography"/>
@@ -4483,12 +4637,12 @@
         <w:t xml:space="preserve">32</w:t>
       </w:r>
       <w:r>
-        <w:t xml:space="preserve">(2), 124.</w:t>
-      </w:r>
-      <w:r>
-        <w:t xml:space="preserve"> </w:t>
-      </w:r>
-      <w:hyperlink r:id="rId112">
+        <w:t xml:space="preserve">(2), 124–158.</w:t>
+      </w:r>
+      <w:r>
+        <w:t xml:space="preserve"> </w:t>
+      </w:r>
+      <w:hyperlink r:id="rId113">
         <w:r>
           <w:rPr>
             <w:rStyle w:val="Hyperlink"/>
@@ -4497,24 +4651,37 @@
         </w:r>
       </w:hyperlink>
     </w:p>
-    <w:bookmarkEnd w:id="113"/>
+    <w:bookmarkEnd w:id="114"/>
     <w:bookmarkStart w:id="115" w:name="ref-frischkorn2023"/>
     <w:p>
       <w:pPr>
         <w:pStyle w:val="Bibliography"/>
       </w:pPr>
       <w:r>
-        <w:t xml:space="preserve">Frischkorn, G. T., &amp; Popov, V. (2023). A Tutorial for Estimating Bayesian Hierarchical Mixture Models for Visual Working Memory Tasks: Introducing the Bayesian Measurement Modeling (bmm) Package for R.</w:t>
-      </w:r>
-      <w:r>
-        <w:t xml:space="preserve"> </w:t>
-      </w:r>
-      <w:hyperlink r:id="rId114">
-        <w:r>
-          <w:rPr>
-            <w:rStyle w:val="Hyperlink"/>
-          </w:rPr>
-          <w:t xml:space="preserve">https://doi.org/10.31234/osf.io/umt57</w:t>
+        <w:t xml:space="preserve">Frischkorn, G. T., &amp; Popov, V. (2023).</w:t>
+      </w:r>
+      <w:r>
+        <w:t xml:space="preserve"> </w:t>
+      </w:r>
+      <w:r>
+        <w:rPr>
+          <w:i/>
+          <w:iCs/>
+        </w:rPr>
+        <w:t xml:space="preserve">A Tutorial for Estimating Bayesian Hierarchical Mixture Models for Visual Working Memory Tasks: Introducing the Bayesian Measurement Modeling (bmm) Package for R</w:t>
+      </w:r>
+      <w:r>
+        <w:t xml:space="preserve">. PsyArXiv.</w:t>
+      </w:r>
+      <w:r>
+        <w:t xml:space="preserve"> </w:t>
+      </w:r>
+      <w:hyperlink r:id="rId107">
+        <w:r>
+          <w:rPr>
+            <w:rStyle w:val="Hyperlink"/>
+          </w:rPr>
+          <w:t xml:space="preserve">https://doi.org/10.1007/978-3-663-09988-8_5</w:t>
         </w:r>
       </w:hyperlink>
     </w:p>
@@ -4525,20 +4692,62 @@
         <w:pStyle w:val="Bibliography"/>
       </w:pPr>
       <w:r>
-        <w:t xml:space="preserve">Garnier, S., Ross, N., BoB Rudis, Filipovic-Pierucci, A., Galili, T., Timelyportfolio, et al. (2023).</w:t>
-      </w:r>
-      <w:r>
-        <w:t xml:space="preserve"> </w:t>
-      </w:r>
-      <w:r>
-        <w:rPr>
-          <w:i/>
-          <w:iCs/>
-        </w:rPr>
-        <w:t xml:space="preserve">sjmgarnier/viridis: CRAN release v0.6.3</w:t>
-      </w:r>
-      <w:r>
-        <w:t xml:space="preserve">. Zenodo.</w:t>
+        <w:t xml:space="preserve">Garnier, S., Ross, N., Rudis, B., Sciaini, M., Camargo, A. P., &amp; Scherer, C. (2024).</w:t>
+      </w:r>
+      <w:r>
+        <w:t xml:space="preserve"> </w:t>
+      </w:r>
+      <w:r>
+        <w:rPr>
+          <w:i/>
+          <w:iCs/>
+        </w:rPr>
+        <w:t xml:space="preserve">Viridis:</w:t>
+      </w:r>
+      <w:r>
+        <w:rPr>
+          <w:i/>
+          <w:iCs/>
+        </w:rPr>
+        <w:t xml:space="preserve"> </w:t>
+      </w:r>
+      <w:r>
+        <w:rPr>
+          <w:i/>
+          <w:iCs/>
+        </w:rPr>
+        <w:t xml:space="preserve">Colorblind-Friendly Color Maps</w:t>
+      </w:r>
+      <w:r>
+        <w:rPr>
+          <w:i/>
+          <w:iCs/>
+        </w:rPr>
+        <w:t xml:space="preserve"> </w:t>
+      </w:r>
+      <w:r>
+        <w:rPr>
+          <w:i/>
+          <w:iCs/>
+        </w:rPr>
+        <w:t xml:space="preserve">for</w:t>
+      </w:r>
+      <w:r>
+        <w:rPr>
+          <w:i/>
+          <w:iCs/>
+        </w:rPr>
+        <w:t xml:space="preserve"> </w:t>
+      </w:r>
+      <w:r>
+        <w:rPr>
+          <w:i/>
+          <w:iCs/>
+        </w:rPr>
+        <w:t xml:space="preserve">R</w:t>
+      </w:r>
+      <w:r>
+        <w:t xml:space="preserve">.</w:t>
       </w:r>
       <w:r>
         <w:t xml:space="preserve"> </w:t>
@@ -4548,7 +4757,7 @@
           <w:rPr>
             <w:rStyle w:val="Hyperlink"/>
           </w:rPr>
-          <w:t xml:space="preserve">https://doi.org/10.5281/ZENODO.4679423</w:t>
+          <w:t xml:space="preserve">https://doi.org/10.32614/CRAN.package.viridis</w:t>
         </w:r>
       </w:hyperlink>
     </w:p>
@@ -4565,10 +4774,22 @@
         <w:t xml:space="preserve"> </w:t>
       </w:r>
       <w:r>
-        <w:t xml:space="preserve">“</w:t>
-      </w:r>
-      <w:r>
-        <w:t xml:space="preserve">A 30.</w:t>
+        <w:t xml:space="preserve">„A</w:t>
+      </w:r>
+      <w:r>
+        <w:t xml:space="preserve"> </w:t>
+      </w:r>
+      <w:r>
+        <w:t xml:space="preserve">30%</w:t>
+      </w:r>
+      <w:r>
+        <w:t xml:space="preserve"> </w:t>
+      </w:r>
+      <w:r>
+        <w:t xml:space="preserve">Chance of Rain Tomorrow“</w:t>
+      </w:r>
+      <w:r>
+        <w:t xml:space="preserve">: How does the public understand probabilistic weather forecasts?</w:t>
       </w:r>
       <w:r>
         <w:t xml:space="preserve"> </w:t>
@@ -4615,7 +4836,7 @@
         <w:pStyle w:val="Bibliography"/>
       </w:pPr>
       <w:r>
-        <w:t xml:space="preserve">Grice, J. W., Medellin, E., Jones, I., Horvath, S., McDaniel, H., O’lansen, C., &amp; Baker, M. (2020). Persons as Effect Sizes.</w:t>
+        <w:t xml:space="preserve">Grice, J. W., Medellin, E., Jones, I., Horvath, S., McDaniel, H., O’lansen, C., &amp; Baker, M. (2020). Persons as effect sizes.</w:t>
       </w:r>
       <w:r>
         <w:t xml:space="preserve"> </w:t>
@@ -4703,12 +4924,59 @@
       </w:hyperlink>
     </w:p>
     <w:bookmarkEnd w:id="123"/>
-    <w:bookmarkStart w:id="124" w:name="ref-hau2012"/>
+    <w:bookmarkStart w:id="125" w:name="ref-gussen2023"/>
     <w:p>
       <w:pPr>
         <w:pStyle w:val="Bibliography"/>
       </w:pPr>
       <w:r>
+        <w:t xml:space="preserve">Gussen, L., Schumacher, F., Großmann, N., Ferreira González, L., Schlüter, K., &amp; Großschedl, J. (2023). Supporting Pre-Service Teachers in Developing Research Competence.</w:t>
+      </w:r>
+      <w:r>
+        <w:t xml:space="preserve"> </w:t>
+      </w:r>
+      <w:r>
+        <w:rPr>
+          <w:i/>
+          <w:iCs/>
+        </w:rPr>
+        <w:t xml:space="preserve">Frontiers in Education</w:t>
+      </w:r>
+      <w:r>
+        <w:t xml:space="preserve">,</w:t>
+      </w:r>
+      <w:r>
+        <w:t xml:space="preserve"> </w:t>
+      </w:r>
+      <w:r>
+        <w:rPr>
+          <w:i/>
+          <w:iCs/>
+        </w:rPr>
+        <w:t xml:space="preserve">8</w:t>
+      </w:r>
+      <w:r>
+        <w:t xml:space="preserve">.</w:t>
+      </w:r>
+      <w:r>
+        <w:t xml:space="preserve"> </w:t>
+      </w:r>
+      <w:hyperlink r:id="rId124">
+        <w:r>
+          <w:rPr>
+            <w:rStyle w:val="Hyperlink"/>
+          </w:rPr>
+          <w:t xml:space="preserve">https://doi.org/10.3389/feduc.2023.1197938</w:t>
+        </w:r>
+      </w:hyperlink>
+    </w:p>
+    <w:bookmarkEnd w:id="125"/>
+    <w:bookmarkStart w:id="126" w:name="ref-hau2012"/>
+    <w:p>
+      <w:pPr>
+        <w:pStyle w:val="Bibliography"/>
+      </w:pPr>
+      <w:r>
         <w:t xml:space="preserve">Hau, R., Martini, U., &amp; Dralle, A. (2012).</w:t>
       </w:r>
       <w:r>
@@ -4725,8 +4993,8 @@
         <w:t xml:space="preserve">. PONS.</w:t>
       </w:r>
     </w:p>
-    <w:bookmarkEnd w:id="124"/>
-    <w:bookmarkStart w:id="125" w:name="ref-helmke2022"/>
+    <w:bookmarkEnd w:id="126"/>
+    <w:bookmarkStart w:id="127" w:name="ref-helmke2022"/>
     <w:p>
       <w:pPr>
         <w:pStyle w:val="Bibliography"/>
@@ -4745,21 +5013,37 @@
         <w:t xml:space="preserve">Unterrichtsqualität und Professionalisierung: Diagnostik von Lehr-Lern-Prozessen und evidenzbasierte Unterrichtsentwicklung</w:t>
       </w:r>
       <w:r>
-        <w:t xml:space="preserve">. Hannover: Klett Kallmeyer.</w:t>
-      </w:r>
-    </w:p>
-    <w:bookmarkEnd w:id="125"/>
-    <w:bookmarkStart w:id="126" w:name="ref-holtappels2007"/>
+        <w:t xml:space="preserve">. Klett Kallmeyer.</w:t>
+      </w:r>
+    </w:p>
+    <w:bookmarkEnd w:id="127"/>
+    <w:bookmarkStart w:id="128" w:name="ref-holtappels2007"/>
     <w:p>
       <w:pPr>
         <w:pStyle w:val="Bibliography"/>
       </w:pPr>
       <w:r>
-        <w:t xml:space="preserve">Holtappels, H. G. (2007). Schulentwicklungsprozesse und Change Management. Innovationstheoretische Reflexionen und Forschungsbefunde über Steuergruppen. In N. Berkemeyer (Hrsg.), (S. 11–39). Weinheim u.a.: Juventa.</w:t>
-      </w:r>
-    </w:p>
-    <w:bookmarkEnd w:id="126"/>
-    <w:bookmarkStart w:id="128" w:name="ref-hullman2015"/>
+        <w:t xml:space="preserve">Holtappels, H. G. (2007).</w:t>
+      </w:r>
+      <w:r>
+        <w:t xml:space="preserve"> </w:t>
+      </w:r>
+      <w:r>
+        <w:rPr>
+          <w:i/>
+          <w:iCs/>
+        </w:rPr>
+        <w:t xml:space="preserve">Schulentwicklungsprozesse und Change Management. Innovationstheoretische Reflexionen und Forschungsbefunde über Steuergruppen.</w:t>
+      </w:r>
+      <w:r>
+        <w:t xml:space="preserve"> </w:t>
+      </w:r>
+      <w:r>
+        <w:t xml:space="preserve">(N. Berkemeyer, Hrsg.; S. 11–39). Juventa.</w:t>
+      </w:r>
+    </w:p>
+    <w:bookmarkEnd w:id="128"/>
+    <w:bookmarkStart w:id="130" w:name="ref-hullman2015"/>
     <w:p>
       <w:pPr>
         <w:pStyle w:val="Bibliography"/>
@@ -4796,7 +5080,7 @@
       <w:r>
         <w:t xml:space="preserve"> </w:t>
       </w:r>
-      <w:hyperlink r:id="rId127">
+      <w:hyperlink r:id="rId129">
         <w:r>
           <w:rPr>
             <w:rStyle w:val="Hyperlink"/>
@@ -4805,14 +5089,14 @@
         </w:r>
       </w:hyperlink>
     </w:p>
-    <w:bookmarkEnd w:id="128"/>
-    <w:bookmarkStart w:id="130" w:name="ref-jones2024"/>
+    <w:bookmarkEnd w:id="130"/>
+    <w:bookmarkStart w:id="132" w:name="ref-jones2024"/>
     <w:p>
       <w:pPr>
         <w:pStyle w:val="Bibliography"/>
       </w:pPr>
       <w:r>
-        <w:t xml:space="preserve">Jones, A. (2024). Rethinking Evidence-Based Practice in Education: A Critical Literature Review of the</w:t>
+        <w:t xml:space="preserve">Jones, A. (2024). Rethinking evidence-based practice in education: A critical literature review of the</w:t>
       </w:r>
       <w:r>
         <w:t xml:space="preserve"> </w:t>
@@ -4861,7 +5145,7 @@
       <w:r>
         <w:t xml:space="preserve"> </w:t>
       </w:r>
-      <w:hyperlink r:id="rId129">
+      <w:hyperlink r:id="rId131">
         <w:r>
           <w:rPr>
             <w:rStyle w:val="Hyperlink"/>
@@ -4870,44 +5154,224 @@
         </w:r>
       </w:hyperlink>
     </w:p>
-    <w:bookmarkEnd w:id="130"/>
-    <w:bookmarkStart w:id="132" w:name="ref-kale2021"/>
+    <w:bookmarkEnd w:id="132"/>
+    <w:bookmarkStart w:id="134" w:name="ref-kale2021"/>
     <w:p>
       <w:pPr>
         <w:pStyle w:val="Bibliography"/>
       </w:pPr>
       <w:r>
-        <w:t xml:space="preserve">Kale, A., Kay, M., &amp; Hullman, J. (2021). Visual</w:t>
-      </w:r>
-      <w:r>
-        <w:t xml:space="preserve"> </w:t>
-      </w:r>
-      <w:r>
-        <w:t xml:space="preserve">Reasoning Strategies</w:t>
-      </w:r>
-      <w:r>
-        <w:t xml:space="preserve"> </w:t>
-      </w:r>
-      <w:r>
-        <w:t xml:space="preserve">for</w:t>
-      </w:r>
-      <w:r>
-        <w:t xml:space="preserve"> </w:t>
-      </w:r>
-      <w:r>
-        <w:t xml:space="preserve">Effect Size Judgments</w:t>
-      </w:r>
-      <w:r>
-        <w:t xml:space="preserve"> </w:t>
-      </w:r>
-      <w:r>
-        <w:t xml:space="preserve">and</w:t>
-      </w:r>
-      <w:r>
-        <w:t xml:space="preserve"> </w:t>
-      </w:r>
-      <w:r>
-        <w:t xml:space="preserve">Decisions</w:t>
+        <w:t xml:space="preserve">Kale, A., Kay, M., &amp; Hullman, J. (2021). Visual reasoning strategies for effect size judgments and decisions.</w:t>
+      </w:r>
+      <w:r>
+        <w:t xml:space="preserve"> </w:t>
+      </w:r>
+      <w:r>
+        <w:rPr>
+          <w:i/>
+          <w:iCs/>
+        </w:rPr>
+        <w:t xml:space="preserve">IEEE Transactions on Visualization and Computer Graphics</w:t>
+      </w:r>
+      <w:r>
+        <w:t xml:space="preserve">,</w:t>
+      </w:r>
+      <w:r>
+        <w:t xml:space="preserve"> </w:t>
+      </w:r>
+      <w:r>
+        <w:rPr>
+          <w:i/>
+          <w:iCs/>
+        </w:rPr>
+        <w:t xml:space="preserve">27</w:t>
+      </w:r>
+      <w:r>
+        <w:t xml:space="preserve">(2), 272–282.</w:t>
+      </w:r>
+      <w:r>
+        <w:t xml:space="preserve"> </w:t>
+      </w:r>
+      <w:hyperlink r:id="rId133">
+        <w:r>
+          <w:rPr>
+            <w:rStyle w:val="Hyperlink"/>
+          </w:rPr>
+          <w:t xml:space="preserve">https://doi.org/10.1109/TVCG.2020.3030335</w:t>
+        </w:r>
+      </w:hyperlink>
+    </w:p>
+    <w:bookmarkEnd w:id="134"/>
+    <w:bookmarkStart w:id="135" w:name="ref-karst2024"/>
+    <w:p>
+      <w:pPr>
+        <w:pStyle w:val="Bibliography"/>
+      </w:pPr>
+      <w:r>
+        <w:t xml:space="preserve">Karst, K., Yendell, O., Marx, A., Lettau, W.-D., &amp; Hawlitschek, P. (2024).</w:t>
+      </w:r>
+      <w:r>
+        <w:t xml:space="preserve"> </w:t>
+      </w:r>
+      <w:r>
+        <w:rPr>
+          <w:i/>
+          <w:iCs/>
+        </w:rPr>
+        <w:t xml:space="preserve">Die Etablierung von Evidenzteams in SchuMaS - Eine Strategie zur systematischen Nutzung von Daten für die Schul- und Unterrichtsentwicklung</w:t>
+      </w:r>
+      <w:r>
+        <w:t xml:space="preserve"> </w:t>
+      </w:r>
+      <w:r>
+        <w:t xml:space="preserve">(K. Maaz &amp; A. Marx, Hrsg.; S. 225–240). Waxmann.</w:t>
+      </w:r>
+    </w:p>
+    <w:bookmarkEnd w:id="135"/>
+    <w:bookmarkStart w:id="136" w:name="ref-kelley1927"/>
+    <w:p>
+      <w:pPr>
+        <w:pStyle w:val="Bibliography"/>
+      </w:pPr>
+      <w:r>
+        <w:t xml:space="preserve">Kelley, T. L. (1927).</w:t>
+      </w:r>
+      <w:r>
+        <w:t xml:space="preserve"> </w:t>
+      </w:r>
+      <w:r>
+        <w:rPr>
+          <w:i/>
+          <w:iCs/>
+        </w:rPr>
+        <w:t xml:space="preserve">Interpretation of educational measurements</w:t>
+      </w:r>
+      <w:r>
+        <w:t xml:space="preserve">. World Book Company.</w:t>
+      </w:r>
+    </w:p>
+    <w:bookmarkEnd w:id="136"/>
+    <w:bookmarkStart w:id="138" w:name="ref-kim2022"/>
+    <w:p>
+      <w:pPr>
+        <w:pStyle w:val="Bibliography"/>
+      </w:pPr>
+      <w:r>
+        <w:t xml:space="preserve">Kim, Y.-S., Hofman, J. M., &amp; Goldstein, D. G. (2022).</w:t>
+      </w:r>
+      <w:r>
+        <w:t xml:space="preserve"> </w:t>
+      </w:r>
+      <w:r>
+        <w:rPr>
+          <w:i/>
+          <w:iCs/>
+        </w:rPr>
+        <w:t xml:space="preserve">CHI ’22: CHI Conference on Human Factors in Computing Systems</w:t>
+      </w:r>
+      <w:r>
+        <w:t xml:space="preserve">. 1–14.</w:t>
+      </w:r>
+      <w:r>
+        <w:t xml:space="preserve"> </w:t>
+      </w:r>
+      <w:hyperlink r:id="rId137">
+        <w:r>
+          <w:rPr>
+            <w:rStyle w:val="Hyperlink"/>
+          </w:rPr>
+          <w:t xml:space="preserve">https://doi.org/10.1145/3491102.3502053</w:t>
+        </w:r>
+      </w:hyperlink>
+    </w:p>
+    <w:bookmarkEnd w:id="138"/>
+    <w:bookmarkStart w:id="139" w:name="ref-kluge2011"/>
+    <w:p>
+      <w:pPr>
+        <w:pStyle w:val="Bibliography"/>
+      </w:pPr>
+      <w:r>
+        <w:t xml:space="preserve">Kluge, F. (2011).</w:t>
+      </w:r>
+      <w:r>
+        <w:t xml:space="preserve"> </w:t>
+      </w:r>
+      <w:r>
+        <w:rPr>
+          <w:i/>
+          <w:iCs/>
+        </w:rPr>
+        <w:t xml:space="preserve">Etymologisches Wörterbuch der deutschen Sprache</w:t>
+      </w:r>
+      <w:r>
+        <w:t xml:space="preserve"> </w:t>
+      </w:r>
+      <w:r>
+        <w:t xml:space="preserve">(25. Aufl.). De Gruyter.</w:t>
+      </w:r>
+    </w:p>
+    <w:bookmarkEnd w:id="139"/>
+    <w:bookmarkStart w:id="140" w:name="ref-leitz2024"/>
+    <w:p>
+      <w:pPr>
+        <w:pStyle w:val="Bibliography"/>
+      </w:pPr>
+      <w:r>
+        <w:t xml:space="preserve">Leitz, A., Kleen, H., Hartmann, U., &amp; Kunter, M. (2024). Was K</w:t>
+      </w:r>
+      <w:r>
+        <w:t xml:space="preserve">ö</w:t>
+      </w:r>
+      <w:r>
+        <w:t xml:space="preserve">nnen Wir Aus Der</w:t>
+      </w:r>
+      <w:r>
+        <w:t xml:space="preserve"> </w:t>
+      </w:r>
+      <w:r>
+        <w:t xml:space="preserve">Grundschullehrkraft-Perspektive</w:t>
+      </w:r>
+      <w:r>
+        <w:t xml:space="preserve"> </w:t>
+      </w:r>
+      <w:r>
+        <w:t xml:space="preserve">Auf</w:t>
+      </w:r>
+      <w:r>
+        <w:t xml:space="preserve"> </w:t>
+      </w:r>
+      <w:r>
+        <w:t xml:space="preserve">Transferaktivit</w:t>
+      </w:r>
+      <w:r>
+        <w:t xml:space="preserve">ä</w:t>
+      </w:r>
+      <w:r>
+        <w:t xml:space="preserve">ten</w:t>
+      </w:r>
+      <w:r>
+        <w:t xml:space="preserve"> </w:t>
+      </w:r>
+      <w:r>
+        <w:t xml:space="preserve">Lernen?</w:t>
+      </w:r>
+      <w:r>
+        <w:t xml:space="preserve"> </w:t>
+      </w:r>
+      <w:r>
+        <w:t xml:space="preserve">Die Vorstellung</w:t>
+      </w:r>
+      <w:r>
+        <w:t xml:space="preserve"> </w:t>
+      </w:r>
+      <w:r>
+        <w:t xml:space="preserve">Eines Kokonstruktiven</w:t>
+      </w:r>
+      <w:r>
+        <w:t xml:space="preserve"> </w:t>
+      </w:r>
+      <w:r>
+        <w:t xml:space="preserve">Clearinghouse-Ansatzes</w:t>
       </w:r>
       <w:r>
         <w:t xml:space="preserve">.</w:t>
@@ -4920,7 +5384,86 @@
           <w:i/>
           <w:iCs/>
         </w:rPr>
-        <w:t xml:space="preserve">IEEE Transactions on Visualization and Computer Graphics</w:t>
+        <w:t xml:space="preserve">Tagung Der</w:t>
+      </w:r>
+      <w:r>
+        <w:rPr>
+          <w:i/>
+          <w:iCs/>
+        </w:rPr>
+        <w:t xml:space="preserve"> </w:t>
+      </w:r>
+      <w:r>
+        <w:rPr>
+          <w:i/>
+          <w:iCs/>
+        </w:rPr>
+        <w:t xml:space="preserve">Gesellschaft</w:t>
+      </w:r>
+      <w:r>
+        <w:rPr>
+          <w:i/>
+          <w:iCs/>
+        </w:rPr>
+        <w:t xml:space="preserve"> </w:t>
+      </w:r>
+      <w:r>
+        <w:rPr>
+          <w:i/>
+          <w:iCs/>
+        </w:rPr>
+        <w:t xml:space="preserve">F</w:t>
+      </w:r>
+      <w:r>
+        <w:rPr>
+          <w:i/>
+          <w:iCs/>
+        </w:rPr>
+        <w:t xml:space="preserve">ü</w:t>
+      </w:r>
+      <w:r>
+        <w:rPr>
+          <w:i/>
+          <w:iCs/>
+        </w:rPr>
+        <w:t xml:space="preserve">r</w:t>
+      </w:r>
+      <w:r>
+        <w:rPr>
+          <w:i/>
+          <w:iCs/>
+        </w:rPr>
+        <w:t xml:space="preserve"> </w:t>
+      </w:r>
+      <w:r>
+        <w:rPr>
+          <w:i/>
+          <w:iCs/>
+        </w:rPr>
+        <w:t xml:space="preserve">Empirische Bildungsforschung</w:t>
+      </w:r>
+      <w:r>
+        <w:t xml:space="preserve">.</w:t>
+      </w:r>
+    </w:p>
+    <w:bookmarkEnd w:id="140"/>
+    <w:bookmarkStart w:id="142" w:name="ref-masnick2009"/>
+    <w:p>
+      <w:pPr>
+        <w:pStyle w:val="Bibliography"/>
+      </w:pPr>
+      <w:r>
+        <w:t xml:space="preserve">Masnick, A. M., &amp; Zimmerman, C. (2009). Evaluating scientific research in the context of prior belief: Hindsight bias or confirmation bias?</w:t>
+      </w:r>
+      <w:r>
+        <w:t xml:space="preserve"> </w:t>
+      </w:r>
+      <w:r>
+        <w:rPr>
+          <w:i/>
+          <w:iCs/>
+        </w:rPr>
+        <w:t xml:space="preserve">Journal of Psychology of Science and Technology</w:t>
       </w:r>
       <w:r>
         <w:t xml:space="preserve">,</w:t>
@@ -4933,131 +5476,254 @@
           <w:i/>
           <w:iCs/>
         </w:rPr>
-        <w:t xml:space="preserve">27</w:t>
-      </w:r>
-      <w:r>
-        <w:t xml:space="preserve">(2), 272–282.</w:t>
-      </w:r>
-      <w:r>
-        <w:t xml:space="preserve"> </w:t>
-      </w:r>
-      <w:hyperlink r:id="rId131">
-        <w:r>
-          <w:rPr>
-            <w:rStyle w:val="Hyperlink"/>
-          </w:rPr>
-          <w:t xml:space="preserve">https://doi.org/10.1109/TVCG.2020.3030335</w:t>
-        </w:r>
-      </w:hyperlink>
-    </w:p>
-    <w:bookmarkEnd w:id="132"/>
-    <w:bookmarkStart w:id="133" w:name="ref-karst2024"/>
+        <w:t xml:space="preserve">2</w:t>
+      </w:r>
+      <w:r>
+        <w:t xml:space="preserve">(1), 29–36.</w:t>
+      </w:r>
+      <w:r>
+        <w:t xml:space="preserve"> </w:t>
+      </w:r>
+      <w:hyperlink r:id="rId141">
+        <w:r>
+          <w:rPr>
+            <w:rStyle w:val="Hyperlink"/>
+          </w:rPr>
+          <w:t xml:space="preserve">https://doi.org/10.1891/1939-7054.2.1.29</w:t>
+        </w:r>
+      </w:hyperlink>
+    </w:p>
+    <w:bookmarkEnd w:id="142"/>
+    <w:bookmarkStart w:id="144" w:name="ref-mcdowell2017"/>
     <w:p>
       <w:pPr>
         <w:pStyle w:val="Bibliography"/>
       </w:pPr>
       <w:r>
-        <w:t xml:space="preserve">Karst, K., Yendell, O., Marx, A., Lettau, W.-D., &amp; Hawlitschek, P. (2024). Die Etablierung von Evidenzteams in SchuMaS - Eine Strategie zur systematischen Nutzung von Daten für die Schul- und Unterrichtsentwicklung. In K. Maaz &amp; A. Marx (Hrsg.), (S. 225–240). Münster: Waxmann.</w:t>
-      </w:r>
-    </w:p>
-    <w:bookmarkEnd w:id="133"/>
-    <w:bookmarkStart w:id="134" w:name="ref-kelley1927"/>
+        <w:t xml:space="preserve">McDowell, M., &amp; Jacobs, P. (2017). Meta-analysis of the effect of natural frequencies on Bayesian reasoning.</w:t>
+      </w:r>
+      <w:r>
+        <w:t xml:space="preserve"> </w:t>
+      </w:r>
+      <w:r>
+        <w:rPr>
+          <w:i/>
+          <w:iCs/>
+        </w:rPr>
+        <w:t xml:space="preserve">Psychological Bulletin</w:t>
+      </w:r>
+      <w:r>
+        <w:t xml:space="preserve">,</w:t>
+      </w:r>
+      <w:r>
+        <w:t xml:space="preserve"> </w:t>
+      </w:r>
+      <w:r>
+        <w:rPr>
+          <w:i/>
+          <w:iCs/>
+        </w:rPr>
+        <w:t xml:space="preserve">143</w:t>
+      </w:r>
+      <w:r>
+        <w:t xml:space="preserve">(12), 1273–1312.</w:t>
+      </w:r>
+      <w:r>
+        <w:t xml:space="preserve"> </w:t>
+      </w:r>
+      <w:hyperlink r:id="rId143">
+        <w:r>
+          <w:rPr>
+            <w:rStyle w:val="Hyperlink"/>
+          </w:rPr>
+          <w:t xml:space="preserve">https://doi.org/10.1037/bul0000126</w:t>
+        </w:r>
+      </w:hyperlink>
+    </w:p>
+    <w:bookmarkEnd w:id="144"/>
+    <w:bookmarkStart w:id="146" w:name="ref-mcmillan2011"/>
     <w:p>
       <w:pPr>
         <w:pStyle w:val="Bibliography"/>
       </w:pPr>
       <w:r>
-        <w:t xml:space="preserve">Kelley, T. L. (1927).</w:t>
-      </w:r>
-      <w:r>
-        <w:t xml:space="preserve"> </w:t>
-      </w:r>
-      <w:r>
-        <w:rPr>
-          <w:i/>
-          <w:iCs/>
-        </w:rPr>
-        <w:t xml:space="preserve">Interpretation of educational measurements</w:t>
-      </w:r>
-      <w:r>
-        <w:t xml:space="preserve">. World Book Company.</w:t>
-      </w:r>
-    </w:p>
-    <w:bookmarkEnd w:id="134"/>
-    <w:bookmarkStart w:id="136" w:name="ref-kim2022"/>
+        <w:t xml:space="preserve">McMillan, J. H., &amp; Jennifer, F. (2011). Reporting and Discussing Effect Size:</w:t>
+      </w:r>
+      <w:r>
+        <w:t xml:space="preserve"> </w:t>
+      </w:r>
+      <w:r>
+        <w:t xml:space="preserve">Still</w:t>
+      </w:r>
+      <w:r>
+        <w:t xml:space="preserve"> </w:t>
+      </w:r>
+      <w:r>
+        <w:t xml:space="preserve">the Road Less Traveled.</w:t>
+      </w:r>
+      <w:r>
+        <w:t xml:space="preserve"> </w:t>
+      </w:r>
+      <w:r>
+        <w:rPr>
+          <w:i/>
+          <w:iCs/>
+        </w:rPr>
+        <w:t xml:space="preserve">Practical Assessment, Research, and Evaluation</w:t>
+      </w:r>
+      <w:r>
+        <w:t xml:space="preserve">,</w:t>
+      </w:r>
+      <w:r>
+        <w:t xml:space="preserve"> </w:t>
+      </w:r>
+      <w:r>
+        <w:rPr>
+          <w:i/>
+          <w:iCs/>
+        </w:rPr>
+        <w:t xml:space="preserve">16</w:t>
+      </w:r>
+      <w:r>
+        <w:t xml:space="preserve">(1).</w:t>
+      </w:r>
+      <w:r>
+        <w:t xml:space="preserve"> </w:t>
+      </w:r>
+      <w:hyperlink r:id="rId145">
+        <w:r>
+          <w:rPr>
+            <w:rStyle w:val="Hyperlink"/>
+          </w:rPr>
+          <w:t xml:space="preserve">https://doi.org/10.7275/B6PZ-WS55</w:t>
+        </w:r>
+      </w:hyperlink>
+    </w:p>
+    <w:bookmarkEnd w:id="146"/>
+    <w:bookmarkStart w:id="148" w:name="ref-merk2020"/>
     <w:p>
       <w:pPr>
         <w:pStyle w:val="Bibliography"/>
       </w:pPr>
       <w:r>
-        <w:t xml:space="preserve">Kim, Y.-S., Hofman, J. M., &amp; Goldstein, D. G. (2022). CHI ’22: CHI Conference on Human Factors in Computing Systems. In (S. 1–14). New Orleans LA USA: ACM.</w:t>
-      </w:r>
-      <w:r>
-        <w:t xml:space="preserve"> </w:t>
-      </w:r>
-      <w:hyperlink r:id="rId135">
-        <w:r>
-          <w:rPr>
-            <w:rStyle w:val="Hyperlink"/>
-          </w:rPr>
-          <w:t xml:space="preserve">https://doi.org/10.1145/3491102.3502053</w:t>
-        </w:r>
-      </w:hyperlink>
-    </w:p>
-    <w:bookmarkEnd w:id="136"/>
-    <w:bookmarkStart w:id="137" w:name="ref-kluge2011"/>
+        <w:t xml:space="preserve">Merk, S., Poindl, S., Wurster, S., &amp; Bohl, T. (2020). Fostering aspects of pre-service teachers’ data literacy: Results of a randomized controlled trial.</w:t>
+      </w:r>
+      <w:r>
+        <w:t xml:space="preserve"> </w:t>
+      </w:r>
+      <w:r>
+        <w:rPr>
+          <w:i/>
+          <w:iCs/>
+        </w:rPr>
+        <w:t xml:space="preserve">Teaching and Teacher Education</w:t>
+      </w:r>
+      <w:r>
+        <w:t xml:space="preserve">,</w:t>
+      </w:r>
+      <w:r>
+        <w:t xml:space="preserve"> </w:t>
+      </w:r>
+      <w:r>
+        <w:rPr>
+          <w:i/>
+          <w:iCs/>
+        </w:rPr>
+        <w:t xml:space="preserve">91</w:t>
+      </w:r>
+      <w:r>
+        <w:t xml:space="preserve">, 103043.</w:t>
+      </w:r>
+      <w:r>
+        <w:t xml:space="preserve"> </w:t>
+      </w:r>
+      <w:hyperlink r:id="rId147">
+        <w:r>
+          <w:rPr>
+            <w:rStyle w:val="Hyperlink"/>
+          </w:rPr>
+          <w:t xml:space="preserve">https://doi.org/10.1016/j.tate.2020.103043</w:t>
+        </w:r>
+      </w:hyperlink>
+    </w:p>
+    <w:bookmarkEnd w:id="148"/>
+    <w:bookmarkStart w:id="150" w:name="ref-michal2024"/>
     <w:p>
       <w:pPr>
         <w:pStyle w:val="Bibliography"/>
       </w:pPr>
       <w:r>
-        <w:t xml:space="preserve">Kluge, F. (2011).</w:t>
-      </w:r>
-      <w:r>
-        <w:t xml:space="preserve"> </w:t>
-      </w:r>
-      <w:r>
-        <w:rPr>
-          <w:i/>
-          <w:iCs/>
-        </w:rPr>
-        <w:t xml:space="preserve">Etymologisches Wörterbuch der deutschen Sprache</w:t>
-      </w:r>
-      <w:r>
-        <w:t xml:space="preserve"> </w:t>
-      </w:r>
-      <w:r>
-        <w:t xml:space="preserve">(25. Aufl.). Berlin: De Gruyter.</w:t>
-      </w:r>
-    </w:p>
-    <w:bookmarkEnd w:id="137"/>
-    <w:bookmarkStart w:id="138" w:name="ref-leitz2024"/>
+        <w:t xml:space="preserve">Michal, A. L., &amp; Shah, P. (2024). A practical significance bias in laypeople’s evaluation of scientific findings.</w:t>
+      </w:r>
+      <w:r>
+        <w:t xml:space="preserve"> </w:t>
+      </w:r>
+      <w:r>
+        <w:rPr>
+          <w:i/>
+          <w:iCs/>
+        </w:rPr>
+        <w:t xml:space="preserve">Psychological Science</w:t>
+      </w:r>
+      <w:r>
+        <w:t xml:space="preserve">, 09567976241231506.</w:t>
+      </w:r>
+      <w:r>
+        <w:t xml:space="preserve"> </w:t>
+      </w:r>
+      <w:hyperlink r:id="rId149">
+        <w:r>
+          <w:rPr>
+            <w:rStyle w:val="Hyperlink"/>
+          </w:rPr>
+          <w:t xml:space="preserve">https://doi.org/10.1177/09567976241231506</w:t>
+        </w:r>
+      </w:hyperlink>
+    </w:p>
+    <w:bookmarkEnd w:id="150"/>
+    <w:bookmarkStart w:id="151" w:name="ref-mitchell2010"/>
     <w:p>
       <w:pPr>
         <w:pStyle w:val="Bibliography"/>
       </w:pPr>
       <w:r>
-        <w:t xml:space="preserve">Leitz, A., Kleen, H., Hartmann, U., &amp; Kunter, M. (2024). Tagung der Gesellschaft für Empirische Bildungsforschung. In. Potsdam.</w:t>
-      </w:r>
-    </w:p>
-    <w:bookmarkEnd w:id="138"/>
-    <w:bookmarkStart w:id="140" w:name="ref-masnick2009"/>
+        <w:t xml:space="preserve">Mitchell, M. L., &amp; Jolley, J. M. (2010).</w:t>
+      </w:r>
+      <w:r>
+        <w:t xml:space="preserve"> </w:t>
+      </w:r>
+      <w:r>
+        <w:rPr>
+          <w:i/>
+          <w:iCs/>
+        </w:rPr>
+        <w:t xml:space="preserve">Research design explained</w:t>
+      </w:r>
+      <w:r>
+        <w:t xml:space="preserve"> </w:t>
+      </w:r>
+      <w:r>
+        <w:t xml:space="preserve">(7. Aufl.). Wadsworth.</w:t>
+      </w:r>
+    </w:p>
+    <w:bookmarkEnd w:id="151"/>
+    <w:bookmarkStart w:id="153" w:name="ref-neuenschwander2005"/>
     <w:p>
       <w:pPr>
         <w:pStyle w:val="Bibliography"/>
       </w:pPr>
       <w:r>
-        <w:t xml:space="preserve">Masnick, A. M., &amp; Zimmerman, C. (2009). Evaluating scientific research in the context of prior belief: Hindsight bias or confirmation bias?</w:t>
-      </w:r>
-      <w:r>
-        <w:t xml:space="preserve"> </w:t>
-      </w:r>
-      <w:r>
-        <w:rPr>
-          <w:i/>
-          <w:iCs/>
-        </w:rPr>
-        <w:t xml:space="preserve">Journal of Psychology of Science and Technology</w:t>
+        <w:t xml:space="preserve">Neuenschwander, M. P. (2005). Forschungskompetenzen in der Lehrerinnen- und Lehrerbildung erweitern: Ein Weiterbildungskonzept.</w:t>
+      </w:r>
+      <w:r>
+        <w:t xml:space="preserve"> </w:t>
+      </w:r>
+      <w:r>
+        <w:rPr>
+          <w:i/>
+          <w:iCs/>
+        </w:rPr>
+        <w:t xml:space="preserve">BzL - Beiträge zur Lehrerinnen- und Lehrerbildung</w:t>
       </w:r>
       <w:r>
         <w:t xml:space="preserve">,</w:t>
@@ -5070,302 +5736,6 @@
           <w:i/>
           <w:iCs/>
         </w:rPr>
-        <w:t xml:space="preserve">2</w:t>
-      </w:r>
-      <w:r>
-        <w:t xml:space="preserve">(1), 29–36.</w:t>
-      </w:r>
-      <w:r>
-        <w:t xml:space="preserve"> </w:t>
-      </w:r>
-      <w:hyperlink r:id="rId139">
-        <w:r>
-          <w:rPr>
-            <w:rStyle w:val="Hyperlink"/>
-          </w:rPr>
-          <w:t xml:space="preserve">https://doi.org/10.1891/1939-7054.2.1.29</w:t>
-        </w:r>
-      </w:hyperlink>
-    </w:p>
-    <w:bookmarkEnd w:id="140"/>
-    <w:bookmarkStart w:id="142" w:name="ref-mcdowell2017"/>
-    <w:p>
-      <w:pPr>
-        <w:pStyle w:val="Bibliography"/>
-      </w:pPr>
-      <w:r>
-        <w:t xml:space="preserve">McDowell, M., &amp; Jacobs, P. (2017). Meta-analysis of the effect of natural frequencies on Bayesian reasoning.</w:t>
-      </w:r>
-      <w:r>
-        <w:t xml:space="preserve"> </w:t>
-      </w:r>
-      <w:r>
-        <w:rPr>
-          <w:i/>
-          <w:iCs/>
-        </w:rPr>
-        <w:t xml:space="preserve">Psychological Bulletin</w:t>
-      </w:r>
-      <w:r>
-        <w:t xml:space="preserve">,</w:t>
-      </w:r>
-      <w:r>
-        <w:t xml:space="preserve"> </w:t>
-      </w:r>
-      <w:r>
-        <w:rPr>
-          <w:i/>
-          <w:iCs/>
-        </w:rPr>
-        <w:t xml:space="preserve">143</w:t>
-      </w:r>
-      <w:r>
-        <w:t xml:space="preserve">(12), 1273–1312.</w:t>
-      </w:r>
-      <w:r>
-        <w:t xml:space="preserve"> </w:t>
-      </w:r>
-      <w:hyperlink r:id="rId141">
-        <w:r>
-          <w:rPr>
-            <w:rStyle w:val="Hyperlink"/>
-          </w:rPr>
-          <w:t xml:space="preserve">https://doi.org/10.1037/bul0000126</w:t>
-        </w:r>
-      </w:hyperlink>
-    </w:p>
-    <w:bookmarkEnd w:id="142"/>
-    <w:bookmarkStart w:id="144" w:name="ref-mcmillan2011"/>
-    <w:p>
-      <w:pPr>
-        <w:pStyle w:val="Bibliography"/>
-      </w:pPr>
-      <w:r>
-        <w:t xml:space="preserve">McMillan, J. H., &amp; Jennifer, F. (2011). Reporting and</w:t>
-      </w:r>
-      <w:r>
-        <w:t xml:space="preserve"> </w:t>
-      </w:r>
-      <w:r>
-        <w:t xml:space="preserve">Discussing Effect Size</w:t>
-      </w:r>
-      <w:r>
-        <w:t xml:space="preserve">:</w:t>
-      </w:r>
-      <w:r>
-        <w:t xml:space="preserve"> </w:t>
-      </w:r>
-      <w:r>
-        <w:t xml:space="preserve">Still</w:t>
-      </w:r>
-      <w:r>
-        <w:t xml:space="preserve"> </w:t>
-      </w:r>
-      <w:r>
-        <w:t xml:space="preserve">the</w:t>
-      </w:r>
-      <w:r>
-        <w:t xml:space="preserve"> </w:t>
-      </w:r>
-      <w:r>
-        <w:t xml:space="preserve">Road Less Traveled</w:t>
-      </w:r>
-      <w:r>
-        <w:t xml:space="preserve">?</w:t>
-      </w:r>
-      <w:r>
-        <w:t xml:space="preserve"> </w:t>
-      </w:r>
-      <w:r>
-        <w:rPr>
-          <w:i/>
-          <w:iCs/>
-        </w:rPr>
-        <w:t xml:space="preserve">Practical Assessment, Research, and Evaluation</w:t>
-      </w:r>
-      <w:r>
-        <w:t xml:space="preserve">,</w:t>
-      </w:r>
-      <w:r>
-        <w:t xml:space="preserve"> </w:t>
-      </w:r>
-      <w:r>
-        <w:rPr>
-          <w:i/>
-          <w:iCs/>
-        </w:rPr>
-        <w:t xml:space="preserve">16</w:t>
-      </w:r>
-      <w:r>
-        <w:t xml:space="preserve">(1).</w:t>
-      </w:r>
-      <w:r>
-        <w:t xml:space="preserve"> </w:t>
-      </w:r>
-      <w:hyperlink r:id="rId143">
-        <w:r>
-          <w:rPr>
-            <w:rStyle w:val="Hyperlink"/>
-          </w:rPr>
-          <w:t xml:space="preserve">https://doi.org/10.7275/B6PZ-WS55</w:t>
-        </w:r>
-      </w:hyperlink>
-    </w:p>
-    <w:bookmarkEnd w:id="144"/>
-    <w:bookmarkStart w:id="146" w:name="ref-merk2020"/>
-    <w:p>
-      <w:pPr>
-        <w:pStyle w:val="Bibliography"/>
-      </w:pPr>
-      <w:r>
-        <w:t xml:space="preserve">Merk, S., Poindl, S., Wurster, S., &amp; Bohl, T. (2020). Fostering Aspects of Pre-Service Teachers’ Data Literacy:</w:t>
-      </w:r>
-      <w:r>
-        <w:t xml:space="preserve"> </w:t>
-      </w:r>
-      <w:r>
-        <w:t xml:space="preserve">Results</w:t>
-      </w:r>
-      <w:r>
-        <w:t xml:space="preserve"> </w:t>
-      </w:r>
-      <w:r>
-        <w:t xml:space="preserve">of a Randomized Controlled Trial.</w:t>
-      </w:r>
-      <w:r>
-        <w:t xml:space="preserve"> </w:t>
-      </w:r>
-      <w:r>
-        <w:rPr>
-          <w:i/>
-          <w:iCs/>
-        </w:rPr>
-        <w:t xml:space="preserve">Teaching and Teacher Education</w:t>
-      </w:r>
-      <w:r>
-        <w:t xml:space="preserve">,</w:t>
-      </w:r>
-      <w:r>
-        <w:t xml:space="preserve"> </w:t>
-      </w:r>
-      <w:r>
-        <w:rPr>
-          <w:i/>
-          <w:iCs/>
-        </w:rPr>
-        <w:t xml:space="preserve">91</w:t>
-      </w:r>
-      <w:r>
-        <w:t xml:space="preserve">, 103043.</w:t>
-      </w:r>
-      <w:r>
-        <w:t xml:space="preserve"> </w:t>
-      </w:r>
-      <w:hyperlink r:id="rId145">
-        <w:r>
-          <w:rPr>
-            <w:rStyle w:val="Hyperlink"/>
-          </w:rPr>
-          <w:t xml:space="preserve">https://doi.org/10.1016/j.tate.2020.103043</w:t>
-        </w:r>
-      </w:hyperlink>
-    </w:p>
-    <w:bookmarkEnd w:id="146"/>
-    <w:bookmarkStart w:id="148" w:name="ref-michal2024"/>
-    <w:p>
-      <w:pPr>
-        <w:pStyle w:val="Bibliography"/>
-      </w:pPr>
-      <w:r>
-        <w:t xml:space="preserve">Michal, A. L., &amp; Shah, P. (2024). A Practical Significance Bias in Laypeople</w:t>
-      </w:r>
-      <w:r>
-        <w:t xml:space="preserve">’</w:t>
-      </w:r>
-      <w:r>
-        <w:t xml:space="preserve">s Evaluation of Scientific Findings.</w:t>
-      </w:r>
-      <w:r>
-        <w:t xml:space="preserve"> </w:t>
-      </w:r>
-      <w:r>
-        <w:rPr>
-          <w:i/>
-          <w:iCs/>
-        </w:rPr>
-        <w:t xml:space="preserve">Psychological Science</w:t>
-      </w:r>
-      <w:r>
-        <w:t xml:space="preserve">, 09567976241231506.</w:t>
-      </w:r>
-      <w:r>
-        <w:t xml:space="preserve"> </w:t>
-      </w:r>
-      <w:hyperlink r:id="rId147">
-        <w:r>
-          <w:rPr>
-            <w:rStyle w:val="Hyperlink"/>
-          </w:rPr>
-          <w:t xml:space="preserve">https://doi.org/10.1177/09567976241231506</w:t>
-        </w:r>
-      </w:hyperlink>
-    </w:p>
-    <w:bookmarkEnd w:id="148"/>
-    <w:bookmarkStart w:id="149" w:name="ref-mitchell2010"/>
-    <w:p>
-      <w:pPr>
-        <w:pStyle w:val="Bibliography"/>
-      </w:pPr>
-      <w:r>
-        <w:t xml:space="preserve">Mitchell, M. L., &amp; Jolley, J. M. (2010).</w:t>
-      </w:r>
-      <w:r>
-        <w:t xml:space="preserve"> </w:t>
-      </w:r>
-      <w:r>
-        <w:rPr>
-          <w:i/>
-          <w:iCs/>
-        </w:rPr>
-        <w:t xml:space="preserve">Research design explained</w:t>
-      </w:r>
-      <w:r>
-        <w:t xml:space="preserve"> </w:t>
-      </w:r>
-      <w:r>
-        <w:t xml:space="preserve">(7. Aufl.). Belmont: Wadsworth.</w:t>
-      </w:r>
-    </w:p>
-    <w:bookmarkEnd w:id="149"/>
-    <w:bookmarkStart w:id="151" w:name="ref-neuenschwander2005"/>
-    <w:p>
-      <w:pPr>
-        <w:pStyle w:val="Bibliography"/>
-      </w:pPr>
-      <w:r>
-        <w:t xml:space="preserve">Neuenschwander, M. P. (2005). Forschungskompetenzen in der Lehrerinnen- und Lehrerbildung erweitern: Ein Weiterbildungskonzept.</w:t>
-      </w:r>
-      <w:r>
-        <w:t xml:space="preserve"> </w:t>
-      </w:r>
-      <w:r>
-        <w:rPr>
-          <w:i/>
-          <w:iCs/>
-        </w:rPr>
-        <w:t xml:space="preserve">BzL - Beiträge zur Lehrerinnen- und Lehrerbildung</w:t>
-      </w:r>
-      <w:r>
-        <w:t xml:space="preserve">,</w:t>
-      </w:r>
-      <w:r>
-        <w:t xml:space="preserve"> </w:t>
-      </w:r>
-      <w:r>
-        <w:rPr>
-          <w:i/>
-          <w:iCs/>
-        </w:rPr>
         <w:t xml:space="preserve">23</w:t>
       </w:r>
       <w:r>
@@ -5374,46 +5744,12 @@
       <w:r>
         <w:t xml:space="preserve"> </w:t>
       </w:r>
-      <w:hyperlink r:id="rId150">
+      <w:hyperlink r:id="rId152">
         <w:r>
           <w:rPr>
             <w:rStyle w:val="Hyperlink"/>
           </w:rPr>
           <w:t xml:space="preserve">https://doi.org/10.36950/bzl.23.2.2005.10132</w:t>
-        </w:r>
-      </w:hyperlink>
-    </w:p>
-    <w:bookmarkEnd w:id="151"/>
-    <w:bookmarkStart w:id="153" w:name="ref-oecd2023a"/>
-    <w:p>
-      <w:pPr>
-        <w:pStyle w:val="Bibliography"/>
-      </w:pPr>
-      <w:r>
-        <w:t xml:space="preserve">OECD (Hrsg.). (2023).</w:t>
-      </w:r>
-      <w:r>
-        <w:t xml:space="preserve"> </w:t>
-      </w:r>
-      <w:r>
-        <w:rPr>
-          <w:i/>
-          <w:iCs/>
-        </w:rPr>
-        <w:t xml:space="preserve">PISA 2022 Ergebnisse (Band I): Lernstände und Bildungsgerechtigkeit</w:t>
-      </w:r>
-      <w:r>
-        <w:t xml:space="preserve">. Bielefeld: wbv Media.</w:t>
-      </w:r>
-      <w:r>
-        <w:t xml:space="preserve"> </w:t>
-      </w:r>
-      <w:hyperlink r:id="rId152">
-        <w:r>
-          <w:rPr>
-            <w:rStyle w:val="Hyperlink"/>
-          </w:rPr>
-          <w:t xml:space="preserve">https://doi.org/10.3278/6004956w</w:t>
         </w:r>
       </w:hyperlink>
     </w:p>
@@ -5424,7 +5760,19 @@
         <w:pStyle w:val="Bibliography"/>
       </w:pPr>
       <w:r>
-        <w:t xml:space="preserve">Pellegrini, M., &amp; Vivanet, G. (2021). Evidence-Based Policies in Education: Initiatives and Challenges in Europe.</w:t>
+        <w:t xml:space="preserve">Pellegrini, M., &amp; Vivanet, G. (2021). Evidence-based policies in education:</w:t>
+      </w:r>
+      <w:r>
+        <w:t xml:space="preserve"> </w:t>
+      </w:r>
+      <w:r>
+        <w:t xml:space="preserve">Initiatives</w:t>
+      </w:r>
+      <w:r>
+        <w:t xml:space="preserve"> </w:t>
+      </w:r>
+      <w:r>
+        <w:t xml:space="preserve">and challenges in europe.</w:t>
       </w:r>
       <w:r>
         <w:t xml:space="preserve"> </w:t>
@@ -5471,7 +5819,20 @@
         <w:pStyle w:val="Bibliography"/>
       </w:pPr>
       <w:r>
-        <w:t xml:space="preserve">RBB, M. K. (2023). Deutsche Schülerinnen und Schüler schneiden bei neuer PISA-Studie so schlecht ab wie nie zuvor.</w:t>
+        <w:t xml:space="preserve">RBB, M. K. (2023).</w:t>
+      </w:r>
+      <w:r>
+        <w:t xml:space="preserve"> </w:t>
+      </w:r>
+      <w:r>
+        <w:rPr>
+          <w:i/>
+          <w:iCs/>
+        </w:rPr>
+        <w:t xml:space="preserve">Deutsche Schülerinnen und Schüler schneiden bei neuer PISA-Studie so schlecht ab wie nie zuvor</w:t>
+      </w:r>
+      <w:r>
+        <w:t xml:space="preserve">.</w:t>
       </w:r>
       <w:r>
         <w:t xml:space="preserve"> </w:t>
@@ -5502,6 +5863,530 @@
           <w:i/>
           <w:iCs/>
         </w:rPr>
+        <w:t xml:space="preserve">Zeitschrift Für Pädagogische Psychologie</w:t>
+      </w:r>
+      <w:r>
+        <w:t xml:space="preserve">,</w:t>
+      </w:r>
+      <w:r>
+        <w:t xml:space="preserve"> </w:t>
+      </w:r>
+      <w:r>
+        <w:rPr>
+          <w:i/>
+          <w:iCs/>
+        </w:rPr>
+        <w:t xml:space="preserve">36</w:t>
+      </w:r>
+      <w:r>
+        <w:t xml:space="preserve">(4), 217–231.</w:t>
+      </w:r>
+      <w:r>
+        <w:t xml:space="preserve"> </w:t>
+      </w:r>
+      <w:hyperlink r:id="rId158">
+        <w:r>
+          <w:rPr>
+            <w:rStyle w:val="Hyperlink"/>
+          </w:rPr>
+          <w:t xml:space="preserve">https://doi.org/10.1024/1010-0652/a000345</w:t>
+        </w:r>
+      </w:hyperlink>
+    </w:p>
+    <w:bookmarkEnd w:id="159"/>
+    <w:bookmarkStart w:id="161" w:name="ref-rycroft-smith2022"/>
+    <w:p>
+      <w:pPr>
+        <w:pStyle w:val="Bibliography"/>
+      </w:pPr>
+      <w:r>
+        <w:t xml:space="preserve">Rycroft-Smith, L., &amp; Stylianides, A. J. (2022). What makes a good educational research summary?</w:t>
+      </w:r>
+      <w:r>
+        <w:t xml:space="preserve"> </w:t>
+      </w:r>
+      <w:r>
+        <w:t xml:space="preserve">A</w:t>
+      </w:r>
+      <w:r>
+        <w:t xml:space="preserve"> </w:t>
+      </w:r>
+      <w:r>
+        <w:t xml:space="preserve">comparative judgement study of mathematics teachers’ and mathematics education researchers’ views.</w:t>
+      </w:r>
+      <w:r>
+        <w:t xml:space="preserve"> </w:t>
+      </w:r>
+      <w:r>
+        <w:rPr>
+          <w:i/>
+          <w:iCs/>
+        </w:rPr>
+        <w:t xml:space="preserve">Review of Education</w:t>
+      </w:r>
+      <w:r>
+        <w:t xml:space="preserve">,</w:t>
+      </w:r>
+      <w:r>
+        <w:t xml:space="preserve"> </w:t>
+      </w:r>
+      <w:r>
+        <w:rPr>
+          <w:i/>
+          <w:iCs/>
+        </w:rPr>
+        <w:t xml:space="preserve">10</w:t>
+      </w:r>
+      <w:r>
+        <w:t xml:space="preserve">(1), e3338.</w:t>
+      </w:r>
+      <w:r>
+        <w:t xml:space="preserve"> </w:t>
+      </w:r>
+      <w:hyperlink r:id="rId160">
+        <w:r>
+          <w:rPr>
+            <w:rStyle w:val="Hyperlink"/>
+          </w:rPr>
+          <w:t xml:space="preserve">https://doi.org/10.1002/rev3.3338</w:t>
+        </w:r>
+      </w:hyperlink>
+    </w:p>
+    <w:bookmarkEnd w:id="161"/>
+    <w:bookmarkStart w:id="163" w:name="ref-Schildkamp2018"/>
+    <w:p>
+      <w:pPr>
+        <w:pStyle w:val="Bibliography"/>
+      </w:pPr>
+      <w:r>
+        <w:t xml:space="preserve">Schildkamp, K., Handelzalts, A., Poortman, C. L., Leusink, H., Meerdink, M., Smit, M., Ebbeler, J., &amp; Hubers, M. D. (2018).</w:t>
+      </w:r>
+      <w:r>
+        <w:t xml:space="preserve"> </w:t>
+      </w:r>
+      <w:r>
+        <w:rPr>
+          <w:i/>
+          <w:iCs/>
+        </w:rPr>
+        <w:t xml:space="preserve">The data team™ procedure:</w:t>
+      </w:r>
+      <w:r>
+        <w:rPr>
+          <w:i/>
+          <w:iCs/>
+        </w:rPr>
+        <w:t xml:space="preserve"> </w:t>
+      </w:r>
+      <w:r>
+        <w:rPr>
+          <w:i/>
+          <w:iCs/>
+        </w:rPr>
+        <w:t xml:space="preserve">A</w:t>
+      </w:r>
+      <w:r>
+        <w:rPr>
+          <w:i/>
+          <w:iCs/>
+        </w:rPr>
+        <w:t xml:space="preserve"> </w:t>
+      </w:r>
+      <w:r>
+        <w:rPr>
+          <w:i/>
+          <w:iCs/>
+        </w:rPr>
+        <w:t xml:space="preserve">systematic approach to school improvement</w:t>
+      </w:r>
+      <w:r>
+        <w:t xml:space="preserve">. Springer.</w:t>
+      </w:r>
+      <w:r>
+        <w:t xml:space="preserve"> </w:t>
+      </w:r>
+      <w:hyperlink r:id="rId162">
+        <w:r>
+          <w:rPr>
+            <w:rStyle w:val="Hyperlink"/>
+          </w:rPr>
+          <w:t xml:space="preserve">https://doi.org/10.1007/978-3-319-58853-7_9</w:t>
+        </w:r>
+      </w:hyperlink>
+    </w:p>
+    <w:bookmarkEnd w:id="163"/>
+    <w:bookmarkStart w:id="165" w:name="ref-schmid2007"/>
+    <w:p>
+      <w:pPr>
+        <w:pStyle w:val="Bibliography"/>
+      </w:pPr>
+      <w:r>
+        <w:t xml:space="preserve">Schmid, S., &amp; Lutz, A. (2007). Epistemologische Überzeugungen als Kohärente Laientheorien.</w:t>
+      </w:r>
+      <w:r>
+        <w:t xml:space="preserve"> </w:t>
+      </w:r>
+      <w:r>
+        <w:rPr>
+          <w:i/>
+          <w:iCs/>
+        </w:rPr>
+        <w:t xml:space="preserve">Zeitschrift für pädagogische Psychologie</w:t>
+      </w:r>
+      <w:r>
+        <w:t xml:space="preserve">,</w:t>
+      </w:r>
+      <w:r>
+        <w:t xml:space="preserve"> </w:t>
+      </w:r>
+      <w:r>
+        <w:rPr>
+          <w:i/>
+          <w:iCs/>
+        </w:rPr>
+        <w:t xml:space="preserve">21</w:t>
+      </w:r>
+      <w:r>
+        <w:t xml:space="preserve">(1), 29–40.</w:t>
+      </w:r>
+      <w:r>
+        <w:t xml:space="preserve"> </w:t>
+      </w:r>
+      <w:hyperlink r:id="rId164">
+        <w:r>
+          <w:rPr>
+            <w:rStyle w:val="Hyperlink"/>
+          </w:rPr>
+          <w:t xml:space="preserve">https://doi.org/10.1024/1010-0652.21.1.29</w:t>
+        </w:r>
+      </w:hyperlink>
+    </w:p>
+    <w:bookmarkEnd w:id="165"/>
+    <w:bookmarkStart w:id="167" w:name="ref-schmidt2024"/>
+    <w:p>
+      <w:pPr>
+        <w:pStyle w:val="Bibliography"/>
+      </w:pPr>
+      <w:r>
+        <w:t xml:space="preserve">Schmidt, K. (2024).</w:t>
+      </w:r>
+      <w:r>
+        <w:t xml:space="preserve"> </w:t>
+      </w:r>
+      <w:r>
+        <w:rPr>
+          <w:i/>
+          <w:iCs/>
+        </w:rPr>
+        <w:t xml:space="preserve">Teachers’ engagement with educational science.</w:t>
+      </w:r>
+      <w:r>
+        <w:rPr>
+          <w:i/>
+          <w:iCs/>
+        </w:rPr>
+        <w:t xml:space="preserve"> </w:t>
+      </w:r>
+      <w:r>
+        <w:rPr>
+          <w:i/>
+          <w:iCs/>
+        </w:rPr>
+        <w:t xml:space="preserve">How</w:t>
+      </w:r>
+      <w:r>
+        <w:rPr>
+          <w:i/>
+          <w:iCs/>
+        </w:rPr>
+        <w:t xml:space="preserve"> </w:t>
+      </w:r>
+      <w:r>
+        <w:rPr>
+          <w:i/>
+          <w:iCs/>
+        </w:rPr>
+        <w:t xml:space="preserve">to communicate findings from educational science in a user-friendly way to teachers</w:t>
+      </w:r>
+      <w:r>
+        <w:t xml:space="preserve"> </w:t>
+      </w:r>
+      <w:r>
+        <w:t xml:space="preserve">[Phdthesis, Pädagogische Hochschule Karlsruhe].</w:t>
+      </w:r>
+      <w:r>
+        <w:t xml:space="preserve"> </w:t>
+      </w:r>
+      <w:hyperlink r:id="rId166">
+        <w:r>
+          <w:rPr>
+            <w:rStyle w:val="Hyperlink"/>
+          </w:rPr>
+          <w:t xml:space="preserve">https://phka.bsz-bw.de/frontdoor/index/index/year/2024/docId/624</w:t>
+        </w:r>
+      </w:hyperlink>
+    </w:p>
+    <w:bookmarkEnd w:id="167"/>
+    <w:bookmarkStart w:id="169" w:name="ref-schmidt2023"/>
+    <w:p>
+      <w:pPr>
+        <w:pStyle w:val="Bibliography"/>
+      </w:pPr>
+      <w:r>
+        <w:t xml:space="preserve">Schmidt, K., Edelsbrunner, P. A., Rosman, T., Cramer, C., &amp; Merk, S. (2023). When perceived informativity is not enough. How teachers perceive and interpret statistical results of educational research.</w:t>
+      </w:r>
+      <w:r>
+        <w:t xml:space="preserve"> </w:t>
+      </w:r>
+      <w:r>
+        <w:rPr>
+          <w:i/>
+          <w:iCs/>
+        </w:rPr>
+        <w:t xml:space="preserve">Teaching and Teacher Education</w:t>
+      </w:r>
+      <w:r>
+        <w:t xml:space="preserve">,</w:t>
+      </w:r>
+      <w:r>
+        <w:t xml:space="preserve"> </w:t>
+      </w:r>
+      <w:r>
+        <w:rPr>
+          <w:i/>
+          <w:iCs/>
+        </w:rPr>
+        <w:t xml:space="preserve">130</w:t>
+      </w:r>
+      <w:r>
+        <w:t xml:space="preserve">, Artikel 104134.</w:t>
+      </w:r>
+      <w:r>
+        <w:t xml:space="preserve"> </w:t>
+      </w:r>
+      <w:hyperlink r:id="rId168">
+        <w:r>
+          <w:rPr>
+            <w:rStyle w:val="Hyperlink"/>
+          </w:rPr>
+          <w:t xml:space="preserve">https://doi.org/10.1016/j.tate.2023.104134</w:t>
+        </w:r>
+      </w:hyperlink>
+    </w:p>
+    <w:bookmarkEnd w:id="169"/>
+    <w:bookmarkStart w:id="171" w:name="ref-schneider2024"/>
+    <w:p>
+      <w:pPr>
+        <w:pStyle w:val="Bibliography"/>
+      </w:pPr>
+      <w:r>
+        <w:t xml:space="preserve">Schneider, J., Schmidt, K., Bohrer, K., &amp; Merk, S. (2024). Communicating Effect Sizes to Teachers.</w:t>
+      </w:r>
+      <w:r>
+        <w:t xml:space="preserve"> </w:t>
+      </w:r>
+      <w:r>
+        <w:rPr>
+          <w:i/>
+          <w:iCs/>
+        </w:rPr>
+        <w:t xml:space="preserve">Zeitschrift Für Psychologie</w:t>
+      </w:r>
+      <w:r>
+        <w:t xml:space="preserve">.</w:t>
+      </w:r>
+      <w:r>
+        <w:t xml:space="preserve"> </w:t>
+      </w:r>
+      <w:hyperlink r:id="rId170">
+        <w:r>
+          <w:rPr>
+            <w:rStyle w:val="Hyperlink"/>
+          </w:rPr>
+          <w:t xml:space="preserve">https://econtent.hogrefe.com/doi/10.1027/2151-2604/a000573</w:t>
+        </w:r>
+      </w:hyperlink>
+    </w:p>
+    <w:bookmarkEnd w:id="171"/>
+    <w:bookmarkStart w:id="173" w:name="ref-sharples2015"/>
+    <w:p>
+      <w:pPr>
+        <w:pStyle w:val="Bibliography"/>
+      </w:pPr>
+      <w:r>
+        <w:t xml:space="preserve">Sharples, J., &amp; Sheard, M. (2015). Developing an evidence-informed support service for schools – reflections on a</w:t>
+      </w:r>
+      <w:r>
+        <w:t xml:space="preserve"> </w:t>
+      </w:r>
+      <w:r>
+        <w:t xml:space="preserve">UK</w:t>
+      </w:r>
+      <w:r>
+        <w:t xml:space="preserve"> </w:t>
+      </w:r>
+      <w:r>
+        <w:t xml:space="preserve">model.</w:t>
+      </w:r>
+      <w:r>
+        <w:t xml:space="preserve"> </w:t>
+      </w:r>
+      <w:r>
+        <w:rPr>
+          <w:i/>
+          <w:iCs/>
+        </w:rPr>
+        <w:t xml:space="preserve">Evidence &amp; Policy</w:t>
+      </w:r>
+      <w:r>
+        <w:t xml:space="preserve">,</w:t>
+      </w:r>
+      <w:r>
+        <w:t xml:space="preserve"> </w:t>
+      </w:r>
+      <w:r>
+        <w:rPr>
+          <w:i/>
+          <w:iCs/>
+        </w:rPr>
+        <w:t xml:space="preserve">11</w:t>
+      </w:r>
+      <w:r>
+        <w:t xml:space="preserve">(4), 577–587.</w:t>
+      </w:r>
+      <w:r>
+        <w:t xml:space="preserve"> </w:t>
+      </w:r>
+      <w:hyperlink r:id="rId172">
+        <w:r>
+          <w:rPr>
+            <w:rStyle w:val="Hyperlink"/>
+          </w:rPr>
+          <w:t xml:space="preserve">https://doi.org/10.1332/174426415X14222958889404</w:t>
+        </w:r>
+      </w:hyperlink>
+    </w:p>
+    <w:bookmarkEnd w:id="173"/>
+    <w:bookmarkStart w:id="174" w:name="ref-shavelson2002"/>
+    <w:p>
+      <w:pPr>
+        <w:pStyle w:val="Bibliography"/>
+      </w:pPr>
+      <w:r>
+        <w:t xml:space="preserve">Shavelson, R. J., &amp; Towne, L. (2002).</w:t>
+      </w:r>
+      <w:r>
+        <w:t xml:space="preserve"> </w:t>
+      </w:r>
+      <w:r>
+        <w:rPr>
+          <w:i/>
+          <w:iCs/>
+        </w:rPr>
+        <w:t xml:space="preserve">Scientific Research in Education</w:t>
+      </w:r>
+      <w:r>
+        <w:t xml:space="preserve">. National Academies Press.</w:t>
+      </w:r>
+    </w:p>
+    <w:bookmarkEnd w:id="174"/>
+    <w:bookmarkStart w:id="176" w:name="ref-slavin2020"/>
+    <w:p>
+      <w:pPr>
+        <w:pStyle w:val="Bibliography"/>
+      </w:pPr>
+      <w:r>
+        <w:t xml:space="preserve">Slavin, R. E. (2020). How evidence-based reform will transform research and practice in education.</w:t>
+      </w:r>
+      <w:r>
+        <w:t xml:space="preserve"> </w:t>
+      </w:r>
+      <w:r>
+        <w:rPr>
+          <w:i/>
+          <w:iCs/>
+        </w:rPr>
+        <w:t xml:space="preserve">Educational Psychologist</w:t>
+      </w:r>
+      <w:r>
+        <w:t xml:space="preserve">,</w:t>
+      </w:r>
+      <w:r>
+        <w:t xml:space="preserve"> </w:t>
+      </w:r>
+      <w:r>
+        <w:rPr>
+          <w:i/>
+          <w:iCs/>
+        </w:rPr>
+        <w:t xml:space="preserve">55</w:t>
+      </w:r>
+      <w:r>
+        <w:t xml:space="preserve">(1), 21–31.</w:t>
+      </w:r>
+      <w:r>
+        <w:t xml:space="preserve"> </w:t>
+      </w:r>
+      <w:hyperlink r:id="rId175">
+        <w:r>
+          <w:rPr>
+            <w:rStyle w:val="Hyperlink"/>
+          </w:rPr>
+          <w:t xml:space="preserve">https://doi.org/10.1080/00461520.2019.1611432</w:t>
+        </w:r>
+      </w:hyperlink>
+    </w:p>
+    <w:bookmarkEnd w:id="176"/>
+    <w:bookmarkStart w:id="178" w:name="ref-standevelopmentteam2024"/>
+    <w:p>
+      <w:pPr>
+        <w:pStyle w:val="Bibliography"/>
+      </w:pPr>
+      <w:r>
+        <w:t xml:space="preserve">Stan Development Team. (2024).</w:t>
+      </w:r>
+      <w:r>
+        <w:t xml:space="preserve"> </w:t>
+      </w:r>
+      <w:r>
+        <w:rPr>
+          <w:i/>
+          <w:iCs/>
+        </w:rPr>
+        <w:t xml:space="preserve">Stan modeling language users guide and reference manual</w:t>
+      </w:r>
+      <w:r>
+        <w:t xml:space="preserve">.</w:t>
+      </w:r>
+      <w:r>
+        <w:t xml:space="preserve"> </w:t>
+      </w:r>
+      <w:hyperlink r:id="rId177">
+        <w:r>
+          <w:rPr>
+            <w:rStyle w:val="Hyperlink"/>
+          </w:rPr>
+          <w:t xml:space="preserve">https://mc-stan.org</w:t>
+        </w:r>
+      </w:hyperlink>
+    </w:p>
+    <w:bookmarkEnd w:id="178"/>
+    <w:bookmarkStart w:id="180" w:name="ref-stark2017"/>
+    <w:p>
+      <w:pPr>
+        <w:pStyle w:val="Bibliography"/>
+      </w:pPr>
+      <w:r>
+        <w:t xml:space="preserve">Stark, R. (2017). Probleme evidenzbasierter bzw. -orientierter pädagogischer Praxis.</w:t>
+      </w:r>
+      <w:r>
+        <w:t xml:space="preserve"> </w:t>
+      </w:r>
+      <w:r>
+        <w:rPr>
+          <w:i/>
+          <w:iCs/>
+        </w:rPr>
         <w:t xml:space="preserve">Zeitschrift für Pädagogische Psychologie</w:t>
       </w:r>
       <w:r>
@@ -5515,68 +6400,172 @@
           <w:i/>
           <w:iCs/>
         </w:rPr>
-        <w:t xml:space="preserve">36</w:t>
-      </w:r>
-      <w:r>
-        <w:t xml:space="preserve">(4), 217–231.</w:t>
-      </w:r>
-      <w:r>
-        <w:t xml:space="preserve"> </w:t>
-      </w:r>
-      <w:hyperlink r:id="rId158">
-        <w:r>
-          <w:rPr>
-            <w:rStyle w:val="Hyperlink"/>
-          </w:rPr>
-          <w:t xml:space="preserve">https://doi.org/10.1024/1010-0652/a000345</w:t>
-        </w:r>
-      </w:hyperlink>
-    </w:p>
-    <w:bookmarkEnd w:id="159"/>
-    <w:bookmarkStart w:id="161" w:name="ref-Schildkamp2018"/>
+        <w:t xml:space="preserve">31</w:t>
+      </w:r>
+      <w:r>
+        <w:t xml:space="preserve">(2), 99–110.</w:t>
+      </w:r>
+      <w:r>
+        <w:t xml:space="preserve"> </w:t>
+      </w:r>
+      <w:hyperlink r:id="rId179">
+        <w:r>
+          <w:rPr>
+            <w:rStyle w:val="Hyperlink"/>
+          </w:rPr>
+          <w:t xml:space="preserve">https://doi.org/10.1024/1010-0652/a000201</w:t>
+        </w:r>
+      </w:hyperlink>
+    </w:p>
+    <w:bookmarkEnd w:id="180"/>
+    <w:bookmarkStart w:id="182" w:name="ref-taz.de2023"/>
     <w:p>
       <w:pPr>
         <w:pStyle w:val="Bibliography"/>
       </w:pPr>
       <w:r>
-        <w:t xml:space="preserve">Schildkamp, K., Handelzalts, A., Poortman, C. L., Leusink, H., Meerdink, M., Smit, M., et al. (2018). The data team</w:t>
-      </w:r>
-      <w:r>
-        <w:t xml:space="preserve"> </w:t>
-      </w:r>
-      <w:r>
-        <w:t xml:space="preserve">procedure: a systematic approach to school improvement. In K. Schildkamp, A. Handelzalts, C. L. Poortman, H. Leusink, M. Meerdink, M. Smit, et al. (Hrsg.),. Springer International Publishing.</w:t>
-      </w:r>
-      <w:r>
-        <w:t xml:space="preserve"> </w:t>
-      </w:r>
-      <w:hyperlink r:id="rId160">
-        <w:r>
-          <w:rPr>
-            <w:rStyle w:val="Hyperlink"/>
-          </w:rPr>
-          <w:t xml:space="preserve">https://doi.org/10.1007/978-3-319-58853-7_9</w:t>
-        </w:r>
-      </w:hyperlink>
-    </w:p>
-    <w:bookmarkEnd w:id="161"/>
-    <w:bookmarkStart w:id="163" w:name="ref-schmid2007"/>
+        <w:t xml:space="preserve">taz.de. (2023).</w:t>
+      </w:r>
+      <w:r>
+        <w:t xml:space="preserve"> </w:t>
+      </w:r>
+      <w:r>
+        <w:rPr>
+          <w:i/>
+          <w:iCs/>
+        </w:rPr>
+        <w:t xml:space="preserve">Pisa-Schock für deutsche Schü</w:t>
+      </w:r>
+      <w:r>
+        <w:rPr>
+          <w:i/>
+          <w:iCs/>
+        </w:rPr>
+        <w:softHyphen/>
+      </w:r>
+      <w:r>
+        <w:rPr>
+          <w:i/>
+          <w:iCs/>
+        </w:rPr>
+        <w:t xml:space="preserve">le</w:t>
+      </w:r>
+      <w:r>
+        <w:rPr>
+          <w:i/>
+          <w:iCs/>
+        </w:rPr>
+        <w:softHyphen/>
+      </w:r>
+      <w:r>
+        <w:rPr>
+          <w:i/>
+          <w:iCs/>
+        </w:rPr>
+        <w:t xml:space="preserve">r:in</w:t>
+      </w:r>
+      <w:r>
+        <w:rPr>
+          <w:i/>
+          <w:iCs/>
+        </w:rPr>
+        <w:softHyphen/>
+      </w:r>
+      <w:r>
+        <w:rPr>
+          <w:i/>
+          <w:iCs/>
+        </w:rPr>
+        <w:t xml:space="preserve">nen: Im freien Fall | taz.de</w:t>
+      </w:r>
+      <w:r>
+        <w:t xml:space="preserve">.</w:t>
+      </w:r>
+      <w:r>
+        <w:t xml:space="preserve"> </w:t>
+      </w:r>
+      <w:hyperlink r:id="rId181">
+        <w:r>
+          <w:rPr>
+            <w:rStyle w:val="Hyperlink"/>
+          </w:rPr>
+          <w:t xml:space="preserve">https://taz.de/Pisa-Schock-fuer-deutsche-Schuelerinnen/!5974146/</w:t>
+        </w:r>
+      </w:hyperlink>
+    </w:p>
+    <w:bookmarkEnd w:id="182"/>
+    <w:bookmarkStart w:id="184" w:name="ref-thorndike1904"/>
     <w:p>
       <w:pPr>
         <w:pStyle w:val="Bibliography"/>
       </w:pPr>
       <w:r>
-        <w:t xml:space="preserve">Schmid, S., &amp; Lutz, A. (2007). Epistemologische Überzeugungen als Kohärente Laientheorien.</w:t>
-      </w:r>
-      <w:r>
-        <w:t xml:space="preserve"> </w:t>
-      </w:r>
-      <w:r>
-        <w:rPr>
-          <w:i/>
-          <w:iCs/>
-        </w:rPr>
-        <w:t xml:space="preserve">Zeitschrift für pädagogische Psychologie</w:t>
+        <w:t xml:space="preserve">Thorndike, E. L. (1904).</w:t>
+      </w:r>
+      <w:r>
+        <w:t xml:space="preserve"> </w:t>
+      </w:r>
+      <w:r>
+        <w:rPr>
+          <w:i/>
+          <w:iCs/>
+        </w:rPr>
+        <w:t xml:space="preserve">Theory of mental and social measurements.</w:t>
+      </w:r>
+      <w:r>
+        <w:t xml:space="preserve"> The Science Press.</w:t>
+      </w:r>
+      <w:r>
+        <w:t xml:space="preserve"> </w:t>
+      </w:r>
+      <w:hyperlink r:id="rId183">
+        <w:r>
+          <w:rPr>
+            <w:rStyle w:val="Hyperlink"/>
+          </w:rPr>
+          <w:t xml:space="preserve">https://doi.org/10.1037/13283-000</w:t>
+        </w:r>
+      </w:hyperlink>
+    </w:p>
+    <w:bookmarkEnd w:id="184"/>
+    <w:bookmarkStart w:id="186" w:name="ref-vehtari2021prefix"/>
+    <w:p>
+      <w:pPr>
+        <w:pStyle w:val="Bibliography"/>
+      </w:pPr>
+      <w:r>
+        <w:t xml:space="preserve">Vehtari, A., Gelman, A., Simpson, D., Carpenter, B., &amp; Bürkner, P.-C. (2021). Rank-Normalization, Folding, and Localization: An Improved</w:t>
+      </w:r>
+      <w:r>
+        <w:t xml:space="preserve"> </w:t>
+      </w:r>
+      <m:oMath>
+        <m:acc>
+          <m:accPr>
+            <m:chr m:val="̂"/>
+          </m:accPr>
+          <m:e>
+            <m:r>
+              <m:t>R</m:t>
+            </m:r>
+          </m:e>
+        </m:acc>
+      </m:oMath>
+      <w:r>
+        <w:t xml:space="preserve"> </w:t>
+      </w:r>
+      <w:r>
+        <w:t xml:space="preserve">for Assessing Convergence of MCMC (with Discussion).</w:t>
+      </w:r>
+      <w:r>
+        <w:t xml:space="preserve"> </w:t>
+      </w:r>
+      <w:r>
+        <w:rPr>
+          <w:i/>
+          <w:iCs/>
+        </w:rPr>
+        <w:t xml:space="preserve">Bayesian Analysis</w:t>
       </w:r>
       <w:r>
         <w:t xml:space="preserve">,</w:t>
@@ -5589,88 +6578,41 @@
           <w:i/>
           <w:iCs/>
         </w:rPr>
-        <w:t xml:space="preserve">21</w:t>
-      </w:r>
-      <w:r>
-        <w:t xml:space="preserve">(1), 29–40.</w:t>
-      </w:r>
-      <w:r>
-        <w:t xml:space="preserve"> </w:t>
-      </w:r>
-      <w:hyperlink r:id="rId162">
-        <w:r>
-          <w:rPr>
-            <w:rStyle w:val="Hyperlink"/>
-          </w:rPr>
-          <w:t xml:space="preserve">https://doi.org/10.1024/1010-0652.21.1.29</w:t>
-        </w:r>
-      </w:hyperlink>
-    </w:p>
-    <w:bookmarkEnd w:id="163"/>
-    <w:bookmarkStart w:id="164" w:name="ref-schmidt2024"/>
+        <w:t xml:space="preserve">16</w:t>
+      </w:r>
+      <w:r>
+        <w:t xml:space="preserve">(2), 667–718.</w:t>
+      </w:r>
+      <w:r>
+        <w:t xml:space="preserve"> </w:t>
+      </w:r>
+      <w:hyperlink r:id="rId185">
+        <w:r>
+          <w:rPr>
+            <w:rStyle w:val="Hyperlink"/>
+          </w:rPr>
+          <w:t xml:space="preserve">https://doi.org/10.1214/20-BA1221</w:t>
+        </w:r>
+      </w:hyperlink>
+    </w:p>
+    <w:bookmarkEnd w:id="186"/>
+    <w:bookmarkStart w:id="188" w:name="ref-zhang2023"/>
     <w:p>
       <w:pPr>
         <w:pStyle w:val="Bibliography"/>
       </w:pPr>
       <w:r>
-        <w:t xml:space="preserve">Schmidt, K. (2024).</w:t>
-      </w:r>
-      <w:r>
-        <w:t xml:space="preserve"> </w:t>
-      </w:r>
-      <w:r>
-        <w:rPr>
-          <w:i/>
-          <w:iCs/>
-        </w:rPr>
-        <w:t xml:space="preserve">Teachers</w:t>
-      </w:r>
-      <w:r>
-        <w:rPr>
-          <w:i/>
-          <w:iCs/>
-        </w:rPr>
-        <w:t xml:space="preserve">’</w:t>
-      </w:r>
-      <w:r>
-        <w:rPr>
-          <w:i/>
-          <w:iCs/>
-        </w:rPr>
-        <w:t xml:space="preserve"> </w:t>
-      </w:r>
-      <w:r>
-        <w:rPr>
-          <w:i/>
-          <w:iCs/>
-        </w:rPr>
-        <w:t xml:space="preserve">Engagement With Educational Science How to Communicate Findings From Educational Science in a User-Friendly Way to Teachers</w:t>
-      </w:r>
-      <w:r>
-        <w:t xml:space="preserve"> </w:t>
-      </w:r>
-      <w:r>
-        <w:t xml:space="preserve">(phdthesis). Karlsruhe.</w:t>
-      </w:r>
-    </w:p>
-    <w:bookmarkEnd w:id="164"/>
-    <w:bookmarkStart w:id="166" w:name="ref-schmidt2023"/>
-    <w:p>
-      <w:pPr>
-        <w:pStyle w:val="Bibliography"/>
-      </w:pPr>
-      <w:r>
-        <w:t xml:space="preserve">Schmidt, K., Edelsbrunner, P. A., Rosman, T., Cramer, C., &amp; Merk, S. (2023). When perceived informativity is not enough. How teachers perceive and interpret statistical results of educational research.</w:t>
-      </w:r>
-      <w:r>
-        <w:t xml:space="preserve"> </w:t>
-      </w:r>
-      <w:r>
-        <w:rPr>
-          <w:i/>
-          <w:iCs/>
-        </w:rPr>
-        <w:t xml:space="preserve">Teaching and Teacher Education</w:t>
+        <w:t xml:space="preserve">Zhang, S., Heck, P. R., Meyer, M. N., Chabris, C. F., Goldstein, D. G., &amp; Hofman, J. M. (2023). An illusion of predictability in scientific results: Even experts confuse inferential uncertainty and outcome variability.</w:t>
+      </w:r>
+      <w:r>
+        <w:t xml:space="preserve"> </w:t>
+      </w:r>
+      <w:r>
+        <w:rPr>
+          <w:i/>
+          <w:iCs/>
+        </w:rPr>
+        <w:t xml:space="preserve">Proceedings of the National Academy of Sciences</w:t>
       </w:r>
       <w:r>
         <w:t xml:space="preserve">,</w:t>
@@ -5683,417 +6625,6 @@
           <w:i/>
           <w:iCs/>
         </w:rPr>
-        <w:t xml:space="preserve">130</w:t>
-      </w:r>
-      <w:r>
-        <w:t xml:space="preserve">, Artikel 104134.</w:t>
-      </w:r>
-      <w:r>
-        <w:t xml:space="preserve"> </w:t>
-      </w:r>
-      <w:hyperlink r:id="rId165">
-        <w:r>
-          <w:rPr>
-            <w:rStyle w:val="Hyperlink"/>
-          </w:rPr>
-          <w:t xml:space="preserve">https://doi.org/10.1016/j.tate.2023.104134</w:t>
-        </w:r>
-      </w:hyperlink>
-    </w:p>
-    <w:bookmarkEnd w:id="166"/>
-    <w:bookmarkStart w:id="168" w:name="ref-schneider2024"/>
-    <w:p>
-      <w:pPr>
-        <w:pStyle w:val="Bibliography"/>
-      </w:pPr>
-      <w:r>
-        <w:t xml:space="preserve">Schneider, J., Schmidt, K., Bohrer, K., &amp; Merk, S. (2024). Communicating Effect Sizes to Teachers.</w:t>
-      </w:r>
-      <w:r>
-        <w:t xml:space="preserve"> </w:t>
-      </w:r>
-      <w:r>
-        <w:rPr>
-          <w:i/>
-          <w:iCs/>
-        </w:rPr>
-        <w:t xml:space="preserve">Zeitschrift für Psychologie</w:t>
-      </w:r>
-      <w:r>
-        <w:t xml:space="preserve">.</w:t>
-      </w:r>
-      <w:r>
-        <w:t xml:space="preserve"> </w:t>
-      </w:r>
-      <w:hyperlink r:id="rId167">
-        <w:r>
-          <w:rPr>
-            <w:rStyle w:val="Hyperlink"/>
-          </w:rPr>
-          <w:t xml:space="preserve">https://econtent.hogrefe.com/doi/10.1027/2151-2604/a000573</w:t>
-        </w:r>
-      </w:hyperlink>
-    </w:p>
-    <w:bookmarkEnd w:id="168"/>
-    <w:bookmarkStart w:id="170" w:name="ref-sharples2015"/>
-    <w:p>
-      <w:pPr>
-        <w:pStyle w:val="Bibliography"/>
-      </w:pPr>
-      <w:r>
-        <w:t xml:space="preserve">Sharples, J., &amp; Sheard, M. (2015). Developing an Evidence-Informed Support Service for Schools – Reflections on a</w:t>
-      </w:r>
-      <w:r>
-        <w:t xml:space="preserve"> </w:t>
-      </w:r>
-      <w:r>
-        <w:t xml:space="preserve">UK</w:t>
-      </w:r>
-      <w:r>
-        <w:t xml:space="preserve"> </w:t>
-      </w:r>
-      <w:r>
-        <w:t xml:space="preserve">Model.</w:t>
-      </w:r>
-      <w:r>
-        <w:t xml:space="preserve"> </w:t>
-      </w:r>
-      <w:r>
-        <w:rPr>
-          <w:i/>
-          <w:iCs/>
-        </w:rPr>
-        <w:t xml:space="preserve">Evidence &amp; Policy</w:t>
-      </w:r>
-      <w:r>
-        <w:t xml:space="preserve">,</w:t>
-      </w:r>
-      <w:r>
-        <w:t xml:space="preserve"> </w:t>
-      </w:r>
-      <w:r>
-        <w:rPr>
-          <w:i/>
-          <w:iCs/>
-        </w:rPr>
-        <w:t xml:space="preserve">11</w:t>
-      </w:r>
-      <w:r>
-        <w:t xml:space="preserve">(4), 577–587.</w:t>
-      </w:r>
-      <w:r>
-        <w:t xml:space="preserve"> </w:t>
-      </w:r>
-      <w:hyperlink r:id="rId169">
-        <w:r>
-          <w:rPr>
-            <w:rStyle w:val="Hyperlink"/>
-          </w:rPr>
-          <w:t xml:space="preserve">https://doi.org/10.1332/174426415X14222958889404</w:t>
-        </w:r>
-      </w:hyperlink>
-    </w:p>
-    <w:bookmarkEnd w:id="170"/>
-    <w:bookmarkStart w:id="171" w:name="ref-shavelson2002"/>
-    <w:p>
-      <w:pPr>
-        <w:pStyle w:val="Bibliography"/>
-      </w:pPr>
-      <w:r>
-        <w:t xml:space="preserve">Shavelson, R. J., &amp; Towne, L. (2002).</w:t>
-      </w:r>
-      <w:r>
-        <w:t xml:space="preserve"> </w:t>
-      </w:r>
-      <w:r>
-        <w:rPr>
-          <w:i/>
-          <w:iCs/>
-        </w:rPr>
-        <w:t xml:space="preserve">Scientific Research in Education</w:t>
-      </w:r>
-      <w:r>
-        <w:t xml:space="preserve">. Washington: National Academies Press.</w:t>
-      </w:r>
-    </w:p>
-    <w:bookmarkEnd w:id="171"/>
-    <w:bookmarkStart w:id="173" w:name="ref-slavin2020"/>
-    <w:p>
-      <w:pPr>
-        <w:pStyle w:val="Bibliography"/>
-      </w:pPr>
-      <w:r>
-        <w:t xml:space="preserve">Slavin, R. E. (2020). How evidence-based reform will transform research and practice in education.</w:t>
-      </w:r>
-      <w:r>
-        <w:t xml:space="preserve"> </w:t>
-      </w:r>
-      <w:r>
-        <w:rPr>
-          <w:i/>
-          <w:iCs/>
-        </w:rPr>
-        <w:t xml:space="preserve">Educational Psychologist</w:t>
-      </w:r>
-      <w:r>
-        <w:t xml:space="preserve">,</w:t>
-      </w:r>
-      <w:r>
-        <w:t xml:space="preserve"> </w:t>
-      </w:r>
-      <w:r>
-        <w:rPr>
-          <w:i/>
-          <w:iCs/>
-        </w:rPr>
-        <w:t xml:space="preserve">55</w:t>
-      </w:r>
-      <w:r>
-        <w:t xml:space="preserve">(1), 21–31.</w:t>
-      </w:r>
-      <w:r>
-        <w:t xml:space="preserve"> </w:t>
-      </w:r>
-      <w:hyperlink r:id="rId172">
-        <w:r>
-          <w:rPr>
-            <w:rStyle w:val="Hyperlink"/>
-          </w:rPr>
-          <w:t xml:space="preserve">https://doi.org/10.1080/00461520.2019.1611432</w:t>
-        </w:r>
-      </w:hyperlink>
-    </w:p>
-    <w:bookmarkEnd w:id="173"/>
-    <w:bookmarkStart w:id="175" w:name="ref-standevelopmentteam2024"/>
-    <w:p>
-      <w:pPr>
-        <w:pStyle w:val="Bibliography"/>
-      </w:pPr>
-      <w:r>
-        <w:t xml:space="preserve">Stan Development Team. (2024).</w:t>
-      </w:r>
-      <w:r>
-        <w:t xml:space="preserve"> </w:t>
-      </w:r>
-      <w:r>
-        <w:rPr>
-          <w:i/>
-          <w:iCs/>
-        </w:rPr>
-        <w:t xml:space="preserve">Stan Modeling Language Users Guide and Reference Manual</w:t>
-      </w:r>
-      <w:r>
-        <w:t xml:space="preserve">.</w:t>
-      </w:r>
-      <w:r>
-        <w:t xml:space="preserve"> </w:t>
-      </w:r>
-      <w:hyperlink r:id="rId174">
-        <w:r>
-          <w:rPr>
-            <w:rStyle w:val="Hyperlink"/>
-          </w:rPr>
-          <w:t xml:space="preserve">https://mc-stan.org</w:t>
-        </w:r>
-      </w:hyperlink>
-    </w:p>
-    <w:bookmarkEnd w:id="175"/>
-    <w:bookmarkStart w:id="177" w:name="ref-stark2017"/>
-    <w:p>
-      <w:pPr>
-        <w:pStyle w:val="Bibliography"/>
-      </w:pPr>
-      <w:r>
-        <w:t xml:space="preserve">Stark, R. (2017). Probleme evidenzbasierter bzw. -orientierter pädagogischer Praxis.</w:t>
-      </w:r>
-      <w:r>
-        <w:t xml:space="preserve"> </w:t>
-      </w:r>
-      <w:r>
-        <w:rPr>
-          <w:i/>
-          <w:iCs/>
-        </w:rPr>
-        <w:t xml:space="preserve">Zeitschrift für Pädagogische Psychologie</w:t>
-      </w:r>
-      <w:r>
-        <w:t xml:space="preserve">,</w:t>
-      </w:r>
-      <w:r>
-        <w:t xml:space="preserve"> </w:t>
-      </w:r>
-      <w:r>
-        <w:rPr>
-          <w:i/>
-          <w:iCs/>
-        </w:rPr>
-        <w:t xml:space="preserve">31</w:t>
-      </w:r>
-      <w:r>
-        <w:t xml:space="preserve">(2), 99–110.</w:t>
-      </w:r>
-      <w:r>
-        <w:t xml:space="preserve"> </w:t>
-      </w:r>
-      <w:hyperlink r:id="rId176">
-        <w:r>
-          <w:rPr>
-            <w:rStyle w:val="Hyperlink"/>
-          </w:rPr>
-          <w:t xml:space="preserve">https://doi.org/10.1024/1010-0652/a000201</w:t>
-        </w:r>
-      </w:hyperlink>
-    </w:p>
-    <w:bookmarkEnd w:id="177"/>
-    <w:bookmarkStart w:id="179" w:name="ref-taz.de2023"/>
-    <w:p>
-      <w:pPr>
-        <w:pStyle w:val="Bibliography"/>
-      </w:pPr>
-      <w:r>
-        <w:t xml:space="preserve">taz.de. (2023). Pisa-Schock für deutsche Schü</w:t>
-      </w:r>
-      <w:r>
-        <w:softHyphen/>
-      </w:r>
-      <w:r>
-        <w:t xml:space="preserve">le</w:t>
-      </w:r>
-      <w:r>
-        <w:softHyphen/>
-      </w:r>
-      <w:r>
-        <w:t xml:space="preserve">r:in</w:t>
-      </w:r>
-      <w:r>
-        <w:softHyphen/>
-      </w:r>
-      <w:r>
-        <w:t xml:space="preserve">nen: Im freien Fall | taz.de.</w:t>
-      </w:r>
-      <w:r>
-        <w:t xml:space="preserve"> </w:t>
-      </w:r>
-      <w:hyperlink r:id="rId178">
-        <w:r>
-          <w:rPr>
-            <w:rStyle w:val="Hyperlink"/>
-          </w:rPr>
-          <w:t xml:space="preserve">https://taz.de/Pisa-Schock-fuer-deutsche-Schuelerinnen/!5974146/</w:t>
-        </w:r>
-      </w:hyperlink>
-    </w:p>
-    <w:bookmarkEnd w:id="179"/>
-    <w:bookmarkStart w:id="181" w:name="ref-thorndike1904"/>
-    <w:p>
-      <w:pPr>
-        <w:pStyle w:val="Bibliography"/>
-      </w:pPr>
-      <w:r>
-        <w:t xml:space="preserve">Thorndike, E. L. (1904).</w:t>
-      </w:r>
-      <w:r>
-        <w:t xml:space="preserve"> </w:t>
-      </w:r>
-      <w:r>
-        <w:rPr>
-          <w:i/>
-          <w:iCs/>
-        </w:rPr>
-        <w:t xml:space="preserve">Theory of mental and social measurements.</w:t>
-      </w:r>
-      <w:r>
-        <w:t xml:space="preserve"> The Science Press.</w:t>
-      </w:r>
-      <w:r>
-        <w:t xml:space="preserve"> </w:t>
-      </w:r>
-      <w:hyperlink r:id="rId180">
-        <w:r>
-          <w:rPr>
-            <w:rStyle w:val="Hyperlink"/>
-          </w:rPr>
-          <w:t xml:space="preserve">https://doi.org/10.1037/13283-000</w:t>
-        </w:r>
-      </w:hyperlink>
-    </w:p>
-    <w:bookmarkEnd w:id="181"/>
-    <w:bookmarkStart w:id="183" w:name="ref-vehtari2021prefix"/>
-    <w:p>
-      <w:pPr>
-        <w:pStyle w:val="Bibliography"/>
-      </w:pPr>
-      <w:r>
-        <w:t xml:space="preserve">Vehtari, A., Gelman, A., Simpson, D., Carpenter, B., &amp; Bürkner, P.-C. (2021). Rank-Normalization, Folding, and Localization: An Improved Rˆ for Assessing Convergence of MCMC (with Discussion).</w:t>
-      </w:r>
-      <w:r>
-        <w:t xml:space="preserve"> </w:t>
-      </w:r>
-      <w:r>
-        <w:rPr>
-          <w:i/>
-          <w:iCs/>
-        </w:rPr>
-        <w:t xml:space="preserve">Bayesian Analysis</w:t>
-      </w:r>
-      <w:r>
-        <w:t xml:space="preserve">,</w:t>
-      </w:r>
-      <w:r>
-        <w:t xml:space="preserve"> </w:t>
-      </w:r>
-      <w:r>
-        <w:rPr>
-          <w:i/>
-          <w:iCs/>
-        </w:rPr>
-        <w:t xml:space="preserve">16</w:t>
-      </w:r>
-      <w:r>
-        <w:t xml:space="preserve">(2).</w:t>
-      </w:r>
-      <w:r>
-        <w:t xml:space="preserve"> </w:t>
-      </w:r>
-      <w:hyperlink r:id="rId182">
-        <w:r>
-          <w:rPr>
-            <w:rStyle w:val="Hyperlink"/>
-          </w:rPr>
-          <w:t xml:space="preserve">https://doi.org/10.1214/20-BA1221</w:t>
-        </w:r>
-      </w:hyperlink>
-    </w:p>
-    <w:bookmarkEnd w:id="183"/>
-    <w:bookmarkStart w:id="185" w:name="ref-zhang2023"/>
-    <w:p>
-      <w:pPr>
-        <w:pStyle w:val="Bibliography"/>
-      </w:pPr>
-      <w:r>
-        <w:t xml:space="preserve">Zhang, S., Heck, P. R., Meyer, M. N., Chabris, C. F., Goldstein, D. G., &amp; Hofman, J. M. (2023). An illusion of predictability in scientific results: Even experts confuse inferential uncertainty and outcome variability.</w:t>
-      </w:r>
-      <w:r>
-        <w:t xml:space="preserve"> </w:t>
-      </w:r>
-      <w:r>
-        <w:rPr>
-          <w:i/>
-          <w:iCs/>
-        </w:rPr>
-        <w:t xml:space="preserve">Proceedings of the National Academy of Sciences</w:t>
-      </w:r>
-      <w:r>
-        <w:t xml:space="preserve">,</w:t>
-      </w:r>
-      <w:r>
-        <w:t xml:space="preserve"> </w:t>
-      </w:r>
-      <w:r>
-        <w:rPr>
-          <w:i/>
-          <w:iCs/>
-        </w:rPr>
         <w:t xml:space="preserve">120</w:t>
       </w:r>
       <w:r>
@@ -6102,7 +6633,7 @@
       <w:r>
         <w:t xml:space="preserve"> </w:t>
       </w:r>
-      <w:hyperlink r:id="rId184">
+      <w:hyperlink r:id="rId187">
         <w:r>
           <w:rPr>
             <w:rStyle w:val="Hyperlink"/>
@@ -6111,10 +6642,10 @@
         </w:r>
       </w:hyperlink>
     </w:p>
-    <w:bookmarkEnd w:id="185"/>
-    <w:bookmarkEnd w:id="186"/>
-    <w:bookmarkEnd w:id="187"/>
     <w:bookmarkEnd w:id="188"/>
+    <w:bookmarkEnd w:id="189"/>
+    <w:bookmarkEnd w:id="190"/>
+    <w:bookmarkEnd w:id="191"/>
     <w:sectPr>
       <w:headerReference r:id="rId9" w:type="even"/>
       <w:headerReference r:id="rId11" w:type="default"/>

</xml_diff>